<commit_message>
style/mise en place structure html + ajout dossier CSS
</commit_message>
<xml_diff>
--- a/docs/XX_EP_Journal_de_Bord.docx
+++ b/docs/XX_EP_Journal_de_Bord.docx
@@ -283,6 +283,458 @@
       <w:proofErr w:type="spellEnd"/>
       <w:r>
         <w:t xml:space="preserve"> : penser fonctionnalité pour l’utilisateur et expérience utilisateur. </w:t>
+      </w:r>
+    </w:p>
+    <w:p/>
+    <w:p>
+      <w:pPr>
+        <w:pStyle w:val="Titre1"/>
+      </w:pPr>
+      <w:r>
+        <w:t>Sprint 3 : Squelette HTML</w:t>
+      </w:r>
+    </w:p>
+    <w:p>
+      <w:r>
+        <w:t>Syntaxe de tout début de document : &lt;</w:t>
+      </w:r>
+      <w:proofErr w:type="gramStart"/>
+      <w:r>
+        <w:t> !DOCTYPE</w:t>
+      </w:r>
+      <w:proofErr w:type="gramEnd"/>
+      <w:r>
+        <w:t xml:space="preserve"> html&gt;, &lt;html </w:t>
+      </w:r>
+      <w:proofErr w:type="spellStart"/>
+      <w:r>
+        <w:t>lang</w:t>
+      </w:r>
+      <w:proofErr w:type="spellEnd"/>
+      <w:r>
+        <w:t>= « »&gt; … &lt;/html&gt;</w:t>
+      </w:r>
+    </w:p>
+    <w:p>
+      <w:r>
+        <w:t>Header : pour définir les métadonnées et le titre &lt;</w:t>
+      </w:r>
+      <w:proofErr w:type="spellStart"/>
+      <w:r>
+        <w:t>title</w:t>
+      </w:r>
+      <w:proofErr w:type="spellEnd"/>
+      <w:r>
+        <w:t>&gt;</w:t>
+      </w:r>
+    </w:p>
+    <w:p>
+      <w:pPr>
+        <w:shd w:val="clear" w:color="auto" w:fill="000000"/>
+        <w:spacing w:after="0" w:line="285" w:lineRule="atLeast"/>
+        <w:rPr>
+          <w:rFonts w:ascii="Consolas" w:eastAsia="Times New Roman" w:hAnsi="Consolas" w:cs="Times New Roman"/>
+          <w:color w:val="FFFFFF"/>
+          <w:sz w:val="21"/>
+          <w:szCs w:val="21"/>
+          <w:lang w:eastAsia="fr-FR"/>
+        </w:rPr>
+      </w:pPr>
+      <w:r>
+        <w:rPr>
+          <w:rFonts w:ascii="Consolas" w:eastAsia="Times New Roman" w:hAnsi="Consolas" w:cs="Times New Roman"/>
+          <w:color w:val="808080"/>
+          <w:sz w:val="21"/>
+          <w:szCs w:val="21"/>
+          <w:lang w:eastAsia="fr-FR"/>
+        </w:rPr>
+        <w:t>&lt;</w:t>
+      </w:r>
+      <w:proofErr w:type="spellStart"/>
+      <w:proofErr w:type="gramStart"/>
+      <w:r>
+        <w:rPr>
+          <w:rFonts w:ascii="Consolas" w:eastAsia="Times New Roman" w:hAnsi="Consolas" w:cs="Times New Roman"/>
+          <w:color w:val="569CD6"/>
+          <w:sz w:val="21"/>
+          <w:szCs w:val="21"/>
+          <w:lang w:eastAsia="fr-FR"/>
+        </w:rPr>
+        <w:t>meta</w:t>
+      </w:r>
+      <w:proofErr w:type="spellEnd"/>
+      <w:proofErr w:type="gramEnd"/>
+      <w:r>
+        <w:rPr>
+          <w:rFonts w:ascii="Consolas" w:eastAsia="Times New Roman" w:hAnsi="Consolas" w:cs="Times New Roman"/>
+          <w:color w:val="FFFFFF"/>
+          <w:sz w:val="21"/>
+          <w:szCs w:val="21"/>
+          <w:lang w:eastAsia="fr-FR"/>
+        </w:rPr>
+        <w:t xml:space="preserve"> </w:t>
+      </w:r>
+      <w:proofErr w:type="spellStart"/>
+      <w:r>
+        <w:rPr>
+          <w:rFonts w:ascii="Consolas" w:eastAsia="Times New Roman" w:hAnsi="Consolas" w:cs="Times New Roman"/>
+          <w:color w:val="9CDCFE"/>
+          <w:sz w:val="21"/>
+          <w:szCs w:val="21"/>
+          <w:lang w:eastAsia="fr-FR"/>
+        </w:rPr>
+        <w:t>charset</w:t>
+      </w:r>
+      <w:proofErr w:type="spellEnd"/>
+      <w:r>
+        <w:rPr>
+          <w:rFonts w:ascii="Consolas" w:eastAsia="Times New Roman" w:hAnsi="Consolas" w:cs="Times New Roman"/>
+          <w:color w:val="FFFFFF"/>
+          <w:sz w:val="21"/>
+          <w:szCs w:val="21"/>
+          <w:lang w:eastAsia="fr-FR"/>
+        </w:rPr>
+        <w:t>=</w:t>
+      </w:r>
+      <w:r>
+        <w:rPr>
+          <w:rFonts w:ascii="Consolas" w:eastAsia="Times New Roman" w:hAnsi="Consolas" w:cs="Times New Roman"/>
+          <w:color w:val="CE9178"/>
+          <w:sz w:val="21"/>
+          <w:szCs w:val="21"/>
+          <w:lang w:eastAsia="fr-FR"/>
+        </w:rPr>
+        <w:t>"UTF-8"</w:t>
+      </w:r>
+      <w:r>
+        <w:rPr>
+          <w:rFonts w:ascii="Consolas" w:eastAsia="Times New Roman" w:hAnsi="Consolas" w:cs="Times New Roman"/>
+          <w:color w:val="808080"/>
+          <w:sz w:val="21"/>
+          <w:szCs w:val="21"/>
+          <w:lang w:eastAsia="fr-FR"/>
+        </w:rPr>
+        <w:t>&gt;</w:t>
+      </w:r>
+      <w:r>
+        <w:rPr>
+          <w:rFonts w:ascii="Consolas" w:eastAsia="Times New Roman" w:hAnsi="Consolas" w:cs="Times New Roman"/>
+          <w:color w:val="808080"/>
+          <w:sz w:val="21"/>
+          <w:szCs w:val="21"/>
+          <w:lang w:eastAsia="fr-FR"/>
+        </w:rPr>
+        <w:t xml:space="preserve"> =Pour prendre en compte les caractères spéciaux</w:t>
+      </w:r>
+    </w:p>
+    <w:p>
+      <w:pPr>
+        <w:shd w:val="clear" w:color="auto" w:fill="000000"/>
+        <w:spacing w:after="0" w:line="285" w:lineRule="atLeast"/>
+        <w:rPr>
+          <w:rFonts w:ascii="Consolas" w:eastAsia="Times New Roman" w:hAnsi="Consolas" w:cs="Times New Roman"/>
+          <w:color w:val="FFFFFF"/>
+          <w:sz w:val="21"/>
+          <w:szCs w:val="21"/>
+          <w:lang w:eastAsia="fr-FR"/>
+        </w:rPr>
+      </w:pPr>
+      <w:r>
+        <w:rPr>
+          <w:rFonts w:ascii="Consolas" w:eastAsia="Times New Roman" w:hAnsi="Consolas" w:cs="Times New Roman"/>
+          <w:color w:val="808080"/>
+          <w:sz w:val="21"/>
+          <w:szCs w:val="21"/>
+          <w:lang w:eastAsia="fr-FR"/>
+        </w:rPr>
+        <w:lastRenderedPageBreak/>
+        <w:t>&lt;</w:t>
+      </w:r>
+      <w:proofErr w:type="spellStart"/>
+      <w:proofErr w:type="gramStart"/>
+      <w:r>
+        <w:rPr>
+          <w:rFonts w:ascii="Consolas" w:eastAsia="Times New Roman" w:hAnsi="Consolas" w:cs="Times New Roman"/>
+          <w:color w:val="569CD6"/>
+          <w:sz w:val="21"/>
+          <w:szCs w:val="21"/>
+          <w:lang w:eastAsia="fr-FR"/>
+        </w:rPr>
+        <w:t>meta</w:t>
+      </w:r>
+      <w:proofErr w:type="spellEnd"/>
+      <w:proofErr w:type="gramEnd"/>
+      <w:r>
+        <w:rPr>
+          <w:rFonts w:ascii="Consolas" w:eastAsia="Times New Roman" w:hAnsi="Consolas" w:cs="Times New Roman"/>
+          <w:color w:val="FFFFFF"/>
+          <w:sz w:val="21"/>
+          <w:szCs w:val="21"/>
+          <w:lang w:eastAsia="fr-FR"/>
+        </w:rPr>
+        <w:t xml:space="preserve"> </w:t>
+      </w:r>
+      <w:proofErr w:type="spellStart"/>
+      <w:r>
+        <w:rPr>
+          <w:rFonts w:ascii="Consolas" w:eastAsia="Times New Roman" w:hAnsi="Consolas" w:cs="Times New Roman"/>
+          <w:color w:val="9CDCFE"/>
+          <w:sz w:val="21"/>
+          <w:szCs w:val="21"/>
+          <w:lang w:eastAsia="fr-FR"/>
+        </w:rPr>
+        <w:t>name</w:t>
+      </w:r>
+      <w:proofErr w:type="spellEnd"/>
+      <w:r>
+        <w:rPr>
+          <w:rFonts w:ascii="Consolas" w:eastAsia="Times New Roman" w:hAnsi="Consolas" w:cs="Times New Roman"/>
+          <w:color w:val="FFFFFF"/>
+          <w:sz w:val="21"/>
+          <w:szCs w:val="21"/>
+          <w:lang w:eastAsia="fr-FR"/>
+        </w:rPr>
+        <w:t>=</w:t>
+      </w:r>
+      <w:r>
+        <w:rPr>
+          <w:rFonts w:ascii="Consolas" w:eastAsia="Times New Roman" w:hAnsi="Consolas" w:cs="Times New Roman"/>
+          <w:color w:val="CE9178"/>
+          <w:sz w:val="21"/>
+          <w:szCs w:val="21"/>
+          <w:lang w:eastAsia="fr-FR"/>
+        </w:rPr>
+        <w:t>"</w:t>
+      </w:r>
+      <w:proofErr w:type="spellStart"/>
+      <w:r>
+        <w:rPr>
+          <w:rFonts w:ascii="Consolas" w:eastAsia="Times New Roman" w:hAnsi="Consolas" w:cs="Times New Roman"/>
+          <w:color w:val="CE9178"/>
+          <w:sz w:val="21"/>
+          <w:szCs w:val="21"/>
+          <w:lang w:eastAsia="fr-FR"/>
+        </w:rPr>
+        <w:t>viewport</w:t>
+      </w:r>
+      <w:proofErr w:type="spellEnd"/>
+      <w:r>
+        <w:rPr>
+          <w:rFonts w:ascii="Consolas" w:eastAsia="Times New Roman" w:hAnsi="Consolas" w:cs="Times New Roman"/>
+          <w:color w:val="CE9178"/>
+          <w:sz w:val="21"/>
+          <w:szCs w:val="21"/>
+          <w:lang w:eastAsia="fr-FR"/>
+        </w:rPr>
+        <w:t>"</w:t>
+      </w:r>
+      <w:r>
+        <w:rPr>
+          <w:rFonts w:ascii="Consolas" w:eastAsia="Times New Roman" w:hAnsi="Consolas" w:cs="Times New Roman"/>
+          <w:color w:val="FFFFFF"/>
+          <w:sz w:val="21"/>
+          <w:szCs w:val="21"/>
+          <w:lang w:eastAsia="fr-FR"/>
+        </w:rPr>
+        <w:t xml:space="preserve"> </w:t>
+      </w:r>
+      <w:r>
+        <w:rPr>
+          <w:rFonts w:ascii="Consolas" w:eastAsia="Times New Roman" w:hAnsi="Consolas" w:cs="Times New Roman"/>
+          <w:color w:val="9CDCFE"/>
+          <w:sz w:val="21"/>
+          <w:szCs w:val="21"/>
+          <w:lang w:eastAsia="fr-FR"/>
+        </w:rPr>
+        <w:t>content</w:t>
+      </w:r>
+      <w:r>
+        <w:rPr>
+          <w:rFonts w:ascii="Consolas" w:eastAsia="Times New Roman" w:hAnsi="Consolas" w:cs="Times New Roman"/>
+          <w:color w:val="FFFFFF"/>
+          <w:sz w:val="21"/>
+          <w:szCs w:val="21"/>
+          <w:lang w:eastAsia="fr-FR"/>
+        </w:rPr>
+        <w:t>=</w:t>
+      </w:r>
+      <w:r>
+        <w:rPr>
+          <w:rFonts w:ascii="Consolas" w:eastAsia="Times New Roman" w:hAnsi="Consolas" w:cs="Times New Roman"/>
+          <w:color w:val="CE9178"/>
+          <w:sz w:val="21"/>
+          <w:szCs w:val="21"/>
+          <w:lang w:eastAsia="fr-FR"/>
+        </w:rPr>
+        <w:t>"</w:t>
+      </w:r>
+      <w:proofErr w:type="spellStart"/>
+      <w:r>
+        <w:rPr>
+          <w:rFonts w:ascii="Consolas" w:eastAsia="Times New Roman" w:hAnsi="Consolas" w:cs="Times New Roman"/>
+          <w:color w:val="CE9178"/>
+          <w:sz w:val="21"/>
+          <w:szCs w:val="21"/>
+          <w:lang w:eastAsia="fr-FR"/>
+        </w:rPr>
+        <w:t>width</w:t>
+      </w:r>
+      <w:proofErr w:type="spellEnd"/>
+      <w:r>
+        <w:rPr>
+          <w:rFonts w:ascii="Consolas" w:eastAsia="Times New Roman" w:hAnsi="Consolas" w:cs="Times New Roman"/>
+          <w:color w:val="CE9178"/>
+          <w:sz w:val="21"/>
+          <w:szCs w:val="21"/>
+          <w:lang w:eastAsia="fr-FR"/>
+        </w:rPr>
+        <w:t>=</w:t>
+      </w:r>
+      <w:proofErr w:type="spellStart"/>
+      <w:r>
+        <w:rPr>
+          <w:rFonts w:ascii="Consolas" w:eastAsia="Times New Roman" w:hAnsi="Consolas" w:cs="Times New Roman"/>
+          <w:color w:val="CE9178"/>
+          <w:sz w:val="21"/>
+          <w:szCs w:val="21"/>
+          <w:lang w:eastAsia="fr-FR"/>
+        </w:rPr>
+        <w:t>device-with,initial-scale</w:t>
+      </w:r>
+      <w:proofErr w:type="spellEnd"/>
+      <w:r>
+        <w:rPr>
+          <w:rFonts w:ascii="Consolas" w:eastAsia="Times New Roman" w:hAnsi="Consolas" w:cs="Times New Roman"/>
+          <w:color w:val="CE9178"/>
+          <w:sz w:val="21"/>
+          <w:szCs w:val="21"/>
+          <w:lang w:eastAsia="fr-FR"/>
+        </w:rPr>
+        <w:t>=1.0"</w:t>
+      </w:r>
+      <w:r>
+        <w:rPr>
+          <w:rFonts w:ascii="Consolas" w:eastAsia="Times New Roman" w:hAnsi="Consolas" w:cs="Times New Roman"/>
+          <w:color w:val="808080"/>
+          <w:sz w:val="21"/>
+          <w:szCs w:val="21"/>
+          <w:lang w:eastAsia="fr-FR"/>
+        </w:rPr>
+        <w:t>&gt;</w:t>
+      </w:r>
+      <w:r>
+        <w:rPr>
+          <w:rFonts w:ascii="Consolas" w:eastAsia="Times New Roman" w:hAnsi="Consolas" w:cs="Times New Roman"/>
+          <w:color w:val="808080"/>
+          <w:sz w:val="21"/>
+          <w:szCs w:val="21"/>
+          <w:lang w:eastAsia="fr-FR"/>
+        </w:rPr>
+        <w:t xml:space="preserve"> =&gt;pour formaliser la taille de l’affichage, ici on dit qu’il faut s’adapter à la dimension de l’écran</w:t>
+      </w:r>
+    </w:p>
+    <w:p/>
+    <w:p>
+      <w:r>
+        <w:t>Balise &lt;</w:t>
+      </w:r>
+      <w:proofErr w:type="spellStart"/>
+      <w:r>
+        <w:t>nav</w:t>
+      </w:r>
+      <w:proofErr w:type="spellEnd"/>
+      <w:r>
+        <w:t>&gt; est aussi conteneur. Possibilité d’écrire les liens sous forme de liste non ordonnée (&lt;</w:t>
+      </w:r>
+      <w:proofErr w:type="spellStart"/>
+      <w:r>
+        <w:t>ul</w:t>
+      </w:r>
+      <w:proofErr w:type="spellEnd"/>
+      <w:r>
+        <w:t>&gt; &lt;li&gt;)</w:t>
+      </w:r>
+    </w:p>
+    <w:p>
+      <w:r>
+        <w:t xml:space="preserve">Les fichier </w:t>
+      </w:r>
+      <w:proofErr w:type="spellStart"/>
+      <w:r>
+        <w:t>head.php</w:t>
+      </w:r>
+      <w:proofErr w:type="spellEnd"/>
+      <w:r>
+        <w:t xml:space="preserve">, </w:t>
+      </w:r>
+      <w:proofErr w:type="spellStart"/>
+      <w:r>
+        <w:t>header.php</w:t>
+      </w:r>
+      <w:proofErr w:type="spellEnd"/>
+      <w:r>
+        <w:t xml:space="preserve"> </w:t>
+      </w:r>
+      <w:proofErr w:type="spellStart"/>
+      <w:r>
+        <w:t>etc</w:t>
+      </w:r>
+      <w:proofErr w:type="spellEnd"/>
+      <w:r>
+        <w:t>, ne commence pas par la balise &lt;html&gt; car il y aura des documents HTML imbriqués =&gt; interdit</w:t>
+      </w:r>
+    </w:p>
+    <w:p>
+      <w:r>
+        <w:t xml:space="preserve">Différence entre </w:t>
+      </w:r>
+      <w:proofErr w:type="spellStart"/>
+      <w:r>
+        <w:t>include</w:t>
+      </w:r>
+      <w:proofErr w:type="spellEnd"/>
+      <w:r>
+        <w:t xml:space="preserve"> et page : </w:t>
+      </w:r>
+      <w:proofErr w:type="spellStart"/>
+      <w:r>
+        <w:t>include</w:t>
+      </w:r>
+      <w:proofErr w:type="spellEnd"/>
+      <w:r>
+        <w:t xml:space="preserve"> est un morceau de code alors que page, un code entier pour une autre interface (ex : toute page différente de la page d’accueil)</w:t>
+      </w:r>
+    </w:p>
+    <w:p/>
+    <w:p>
+      <w:pPr>
+        <w:pStyle w:val="Titre1"/>
+      </w:pPr>
+      <w:r>
+        <w:t>Sprint 4 : CSS</w:t>
+      </w:r>
+    </w:p>
+    <w:p>
+      <w:r>
+        <w:t xml:space="preserve">Créer une arborescence : CSS </w:t>
+      </w:r>
+    </w:p>
+    <w:p>
+      <w:r>
+        <w:t>Style.css : po</w:t>
+      </w:r>
+      <w:r>
+        <w:t>ur importer les autres fichiers</w:t>
+      </w:r>
+    </w:p>
+    <w:p>
+      <w:r>
+        <w:t>Variable.css : pour créer toutes les variables et donc les modifier à un seul endroit</w:t>
+      </w:r>
+    </w:p>
+    <w:p>
+      <w:r>
+        <w:t>En CSS, chaque sélecteur est indépendant !!</w:t>
       </w:r>
       <w:bookmarkStart w:id="0" w:name="_GoBack"/>
       <w:bookmarkEnd w:id="0"/>

</xml_diff>

<commit_message>
feat : ajout base de données
</commit_message>
<xml_diff>
--- a/docs/XX_EP_Journal_de_Bord.docx
+++ b/docs/XX_EP_Journal_de_Bord.docx
@@ -946,16 +946,1284 @@
       </w:r>
       <w:proofErr w:type="spellEnd"/>
       <w:r>
-        <w:t>, pour nommer les classes avec cohérence et</w:t>
-      </w:r>
+        <w:t xml:space="preserve">, pour nommer les classes avec cohérence et sans doublon car cela peut mener à des erreurs. </w:t>
+      </w:r>
+    </w:p>
+    <w:p/>
+    <w:p>
+      <w:pPr>
+        <w:pStyle w:val="Titre1"/>
+      </w:pPr>
+      <w:r>
+        <w:t xml:space="preserve">Sprint 5 : Bases de données </w:t>
+      </w:r>
+    </w:p>
+    <w:p>
+      <w:r>
+        <w:t>Conception d’une architecture de bases de données. Le cas d’</w:t>
+      </w:r>
+      <w:proofErr w:type="spellStart"/>
+      <w:r>
+        <w:t>EntrePages</w:t>
+      </w:r>
+      <w:proofErr w:type="spellEnd"/>
+      <w:r>
+        <w:t> : il y a les utilisateurs, les livres, les exemplaires et les emprunts. =&gt; ça sera une base de donnée relationnelle</w:t>
+      </w:r>
+      <w:r>
+        <w:t xml:space="preserve">. </w:t>
+      </w:r>
+    </w:p>
+    <w:p>
+      <w:r>
+        <w:t>MCD : vision métier</w:t>
+      </w:r>
+    </w:p>
+    <w:p>
+      <w:r>
+        <w:rPr>
+          <w:noProof/>
+          <w:lang w:eastAsia="fr-FR"/>
+        </w:rPr>
+        <w:lastRenderedPageBreak/>
+        <mc:AlternateContent>
+          <mc:Choice Requires="wpc">
+            <w:drawing>
+              <wp:inline distT="0" distB="0" distL="0" distR="0">
+                <wp:extent cx="5486400" cy="1747837"/>
+                <wp:effectExtent l="0" t="0" r="0" b="0"/>
+                <wp:docPr id="1" name="Zone de dessin 1"/>
+                <wp:cNvGraphicFramePr>
+                  <a:graphicFrameLocks xmlns:a="http://schemas.openxmlformats.org/drawingml/2006/main" noChangeAspect="1"/>
+                </wp:cNvGraphicFramePr>
+                <a:graphic xmlns:a="http://schemas.openxmlformats.org/drawingml/2006/main">
+                  <a:graphicData uri="http://schemas.microsoft.com/office/word/2010/wordprocessingCanvas">
+                    <wpc:wpc>
+                      <wpc:bg/>
+                      <wpc:whole/>
+                      <wps:wsp>
+                        <wps:cNvPr id="2" name="Zone de texte 2"/>
+                        <wps:cNvSpPr txBox="1"/>
+                        <wps:spPr>
+                          <a:xfrm>
+                            <a:off x="251460" y="335280"/>
+                            <a:ext cx="861060" cy="327660"/>
+                          </a:xfrm>
+                          <a:prstGeom prst="rect">
+                            <a:avLst/>
+                          </a:prstGeom>
+                          <a:solidFill>
+                            <a:schemeClr val="lt1"/>
+                          </a:solidFill>
+                          <a:ln w="6350">
+                            <a:solidFill>
+                              <a:prstClr val="black"/>
+                            </a:solidFill>
+                          </a:ln>
+                        </wps:spPr>
+                        <wps:txbx>
+                          <w:txbxContent>
+                            <w:p>
+                              <w:r>
+                                <w:t>Utilisateur</w:t>
+                              </w:r>
+                            </w:p>
+                          </w:txbxContent>
+                        </wps:txbx>
+                        <wps:bodyPr rot="0" spcFirstLastPara="0" vertOverflow="overflow" horzOverflow="overflow" vert="horz" wrap="square" lIns="91440" tIns="45720" rIns="91440" bIns="45720" numCol="1" spcCol="0" rtlCol="0" fromWordArt="0" anchor="t" anchorCtr="0" forceAA="0" compatLnSpc="1">
+                          <a:prstTxWarp prst="textNoShape">
+                            <a:avLst/>
+                          </a:prstTxWarp>
+                          <a:noAutofit/>
+                        </wps:bodyPr>
+                      </wps:wsp>
+                      <wps:wsp>
+                        <wps:cNvPr id="4" name="Zone de texte 2"/>
+                        <wps:cNvSpPr txBox="1"/>
+                        <wps:spPr>
+                          <a:xfrm>
+                            <a:off x="2359320" y="335280"/>
+                            <a:ext cx="861060" cy="327660"/>
+                          </a:xfrm>
+                          <a:prstGeom prst="rect">
+                            <a:avLst/>
+                          </a:prstGeom>
+                          <a:solidFill>
+                            <a:schemeClr val="lt1"/>
+                          </a:solidFill>
+                          <a:ln w="6350">
+                            <a:solidFill>
+                              <a:prstClr val="black"/>
+                            </a:solidFill>
+                          </a:ln>
+                        </wps:spPr>
+                        <wps:txbx>
+                          <w:txbxContent>
+                            <w:p>
+                              <w:pPr>
+                                <w:pStyle w:val="NormalWeb"/>
+                                <w:spacing w:before="0" w:beforeAutospacing="0" w:after="160" w:afterAutospacing="0" w:line="256" w:lineRule="auto"/>
+                              </w:pPr>
+                              <w:r>
+                                <w:rPr>
+                                  <w:rFonts w:ascii="Calibri" w:eastAsia="Calibri" w:hAnsi="Calibri"/>
+                                  <w:sz w:val="22"/>
+                                  <w:szCs w:val="22"/>
+                                </w:rPr>
+                                <w:t>Exemplaire</w:t>
+                              </w:r>
+                            </w:p>
+                          </w:txbxContent>
+                        </wps:txbx>
+                        <wps:bodyPr rot="0" spcFirstLastPara="0" vert="horz" wrap="square" lIns="91440" tIns="45720" rIns="91440" bIns="45720" numCol="1" spcCol="0" rtlCol="0" fromWordArt="0" anchor="t" anchorCtr="0" forceAA="0" compatLnSpc="1">
+                          <a:prstTxWarp prst="textNoShape">
+                            <a:avLst/>
+                          </a:prstTxWarp>
+                          <a:noAutofit/>
+                        </wps:bodyPr>
+                      </wps:wsp>
+                      <wps:wsp>
+                        <wps:cNvPr id="5" name="Zone de texte 2"/>
+                        <wps:cNvSpPr txBox="1"/>
+                        <wps:spPr>
+                          <a:xfrm>
+                            <a:off x="2359320" y="1323952"/>
+                            <a:ext cx="861060" cy="327660"/>
+                          </a:xfrm>
+                          <a:prstGeom prst="rect">
+                            <a:avLst/>
+                          </a:prstGeom>
+                          <a:solidFill>
+                            <a:schemeClr val="lt1"/>
+                          </a:solidFill>
+                          <a:ln w="6350">
+                            <a:solidFill>
+                              <a:prstClr val="black"/>
+                            </a:solidFill>
+                          </a:ln>
+                        </wps:spPr>
+                        <wps:txbx>
+                          <w:txbxContent>
+                            <w:p>
+                              <w:pPr>
+                                <w:pStyle w:val="NormalWeb"/>
+                                <w:spacing w:before="0" w:beforeAutospacing="0" w:after="160" w:afterAutospacing="0" w:line="254" w:lineRule="auto"/>
+                              </w:pPr>
+                              <w:r>
+                                <w:rPr>
+                                  <w:rFonts w:ascii="Calibri" w:eastAsia="Calibri" w:hAnsi="Calibri"/>
+                                  <w:sz w:val="22"/>
+                                  <w:szCs w:val="22"/>
+                                </w:rPr>
+                                <w:t>Livre</w:t>
+                              </w:r>
+                            </w:p>
+                          </w:txbxContent>
+                        </wps:txbx>
+                        <wps:bodyPr rot="0" spcFirstLastPara="0" vert="horz" wrap="square" lIns="91440" tIns="45720" rIns="91440" bIns="45720" numCol="1" spcCol="0" rtlCol="0" fromWordArt="0" anchor="t" anchorCtr="0" forceAA="0" compatLnSpc="1">
+                          <a:prstTxWarp prst="textNoShape">
+                            <a:avLst/>
+                          </a:prstTxWarp>
+                          <a:noAutofit/>
+                        </wps:bodyPr>
+                      </wps:wsp>
+                      <wps:wsp>
+                        <wps:cNvPr id="6" name="Zone de texte 2"/>
+                        <wps:cNvSpPr txBox="1"/>
+                        <wps:spPr>
+                          <a:xfrm>
+                            <a:off x="4569120" y="335280"/>
+                            <a:ext cx="861060" cy="327660"/>
+                          </a:xfrm>
+                          <a:prstGeom prst="rect">
+                            <a:avLst/>
+                          </a:prstGeom>
+                          <a:solidFill>
+                            <a:schemeClr val="lt1"/>
+                          </a:solidFill>
+                          <a:ln w="6350">
+                            <a:solidFill>
+                              <a:prstClr val="black"/>
+                            </a:solidFill>
+                          </a:ln>
+                        </wps:spPr>
+                        <wps:txbx>
+                          <w:txbxContent>
+                            <w:p>
+                              <w:pPr>
+                                <w:pStyle w:val="NormalWeb"/>
+                                <w:spacing w:before="0" w:beforeAutospacing="0" w:after="160" w:afterAutospacing="0" w:line="252" w:lineRule="auto"/>
+                              </w:pPr>
+                              <w:r>
+                                <w:rPr>
+                                  <w:rFonts w:ascii="Calibri" w:eastAsia="Calibri" w:hAnsi="Calibri"/>
+                                  <w:sz w:val="22"/>
+                                  <w:szCs w:val="22"/>
+                                </w:rPr>
+                                <w:t>Emprunts</w:t>
+                              </w:r>
+                            </w:p>
+                          </w:txbxContent>
+                        </wps:txbx>
+                        <wps:bodyPr rot="0" spcFirstLastPara="0" vert="horz" wrap="square" lIns="91440" tIns="45720" rIns="91440" bIns="45720" numCol="1" spcCol="0" rtlCol="0" fromWordArt="0" anchor="t" anchorCtr="0" forceAA="0" compatLnSpc="1">
+                          <a:prstTxWarp prst="textNoShape">
+                            <a:avLst/>
+                          </a:prstTxWarp>
+                          <a:noAutofit/>
+                        </wps:bodyPr>
+                      </wps:wsp>
+                      <wps:wsp>
+                        <wps:cNvPr id="10" name="Zone de texte 10"/>
+                        <wps:cNvSpPr txBox="1"/>
+                        <wps:spPr>
+                          <a:xfrm>
+                            <a:off x="1379220" y="541020"/>
+                            <a:ext cx="800100" cy="274320"/>
+                          </a:xfrm>
+                          <a:prstGeom prst="rect">
+                            <a:avLst/>
+                          </a:prstGeom>
+                          <a:noFill/>
+                          <a:ln w="6350">
+                            <a:noFill/>
+                          </a:ln>
+                        </wps:spPr>
+                        <wps:txbx>
+                          <w:txbxContent>
+                            <w:p>
+                              <w:r>
+                                <w:t>Possède</w:t>
+                              </w:r>
+                            </w:p>
+                          </w:txbxContent>
+                        </wps:txbx>
+                        <wps:bodyPr rot="0" spcFirstLastPara="0" vertOverflow="overflow" horzOverflow="overflow" vert="horz" wrap="square" lIns="91440" tIns="45720" rIns="91440" bIns="45720" numCol="1" spcCol="0" rtlCol="0" fromWordArt="0" anchor="t" anchorCtr="0" forceAA="0" compatLnSpc="1">
+                          <a:prstTxWarp prst="textNoShape">
+                            <a:avLst/>
+                          </a:prstTxWarp>
+                          <a:noAutofit/>
+                        </wps:bodyPr>
+                      </wps:wsp>
+                      <wps:wsp>
+                        <wps:cNvPr id="11" name="Zone de texte 10"/>
+                        <wps:cNvSpPr txBox="1"/>
+                        <wps:spPr>
+                          <a:xfrm>
+                            <a:off x="2755559" y="919140"/>
+                            <a:ext cx="1449727" cy="274320"/>
+                          </a:xfrm>
+                          <a:prstGeom prst="rect">
+                            <a:avLst/>
+                          </a:prstGeom>
+                          <a:noFill/>
+                          <a:ln w="6350">
+                            <a:noFill/>
+                          </a:ln>
+                        </wps:spPr>
+                        <wps:txbx>
+                          <w:txbxContent>
+                            <w:p>
+                              <w:pPr>
+                                <w:pStyle w:val="NormalWeb"/>
+                                <w:spacing w:before="0" w:beforeAutospacing="0" w:after="160" w:afterAutospacing="0" w:line="256" w:lineRule="auto"/>
+                              </w:pPr>
+                              <w:r>
+                                <w:rPr>
+                                  <w:rFonts w:ascii="Calibri" w:eastAsia="Calibri" w:hAnsi="Calibri"/>
+                                  <w:sz w:val="22"/>
+                                  <w:szCs w:val="22"/>
+                                </w:rPr>
+                                <w:t>Est un exemplaire de</w:t>
+                              </w:r>
+                            </w:p>
+                          </w:txbxContent>
+                        </wps:txbx>
+                        <wps:bodyPr rot="0" spcFirstLastPara="0" vert="horz" wrap="square" lIns="91440" tIns="45720" rIns="91440" bIns="45720" numCol="1" spcCol="0" rtlCol="0" fromWordArt="0" anchor="t" anchorCtr="0" forceAA="0" compatLnSpc="1">
+                          <a:prstTxWarp prst="textNoShape">
+                            <a:avLst/>
+                          </a:prstTxWarp>
+                          <a:noAutofit/>
+                        </wps:bodyPr>
+                      </wps:wsp>
+                      <wps:wsp>
+                        <wps:cNvPr id="12" name="Zone de texte 10"/>
+                        <wps:cNvSpPr txBox="1"/>
+                        <wps:spPr>
+                          <a:xfrm>
+                            <a:off x="3418500" y="454320"/>
+                            <a:ext cx="1123020" cy="445792"/>
+                          </a:xfrm>
+                          <a:prstGeom prst="rect">
+                            <a:avLst/>
+                          </a:prstGeom>
+                          <a:noFill/>
+                          <a:ln w="6350">
+                            <a:noFill/>
+                          </a:ln>
+                        </wps:spPr>
+                        <wps:txbx>
+                          <w:txbxContent>
+                            <w:p>
+                              <w:pPr>
+                                <w:pStyle w:val="NormalWeb"/>
+                                <w:spacing w:before="0" w:beforeAutospacing="0" w:after="160" w:afterAutospacing="0" w:line="254" w:lineRule="auto"/>
+                              </w:pPr>
+                              <w:r>
+                                <w:rPr>
+                                  <w:rFonts w:ascii="Calibri" w:eastAsia="Calibri" w:hAnsi="Calibri"/>
+                                  <w:sz w:val="22"/>
+                                  <w:szCs w:val="22"/>
+                                </w:rPr>
+                                <w:t>Fait l’objet d’un emprunt</w:t>
+                              </w:r>
+                            </w:p>
+                          </w:txbxContent>
+                        </wps:txbx>
+                        <wps:bodyPr rot="0" spcFirstLastPara="0" vert="horz" wrap="square" lIns="91440" tIns="45720" rIns="91440" bIns="45720" numCol="1" spcCol="0" rtlCol="0" fromWordArt="0" anchor="t" anchorCtr="0" forceAA="0" compatLnSpc="1">
+                          <a:prstTxWarp prst="textNoShape">
+                            <a:avLst/>
+                          </a:prstTxWarp>
+                          <a:noAutofit/>
+                        </wps:bodyPr>
+                      </wps:wsp>
+                      <wps:wsp>
+                        <wps:cNvPr id="15" name="Connecteur droit 15"/>
+                        <wps:cNvCnPr>
+                          <a:stCxn id="2" idx="3"/>
+                          <a:endCxn id="4" idx="1"/>
+                        </wps:cNvCnPr>
+                        <wps:spPr>
+                          <a:xfrm>
+                            <a:off x="1112520" y="499110"/>
+                            <a:ext cx="1246800" cy="0"/>
+                          </a:xfrm>
+                          <a:prstGeom prst="line">
+                            <a:avLst/>
+                          </a:prstGeom>
+                        </wps:spPr>
+                        <wps:style>
+                          <a:lnRef idx="1">
+                            <a:schemeClr val="accent1"/>
+                          </a:lnRef>
+                          <a:fillRef idx="0">
+                            <a:schemeClr val="accent1"/>
+                          </a:fillRef>
+                          <a:effectRef idx="0">
+                            <a:schemeClr val="accent1"/>
+                          </a:effectRef>
+                          <a:fontRef idx="minor">
+                            <a:schemeClr val="tx1"/>
+                          </a:fontRef>
+                        </wps:style>
+                        <wps:bodyPr/>
+                      </wps:wsp>
+                      <wps:wsp>
+                        <wps:cNvPr id="16" name="Connecteur droit 16"/>
+                        <wps:cNvCnPr>
+                          <a:endCxn id="6" idx="1"/>
+                        </wps:cNvCnPr>
+                        <wps:spPr>
+                          <a:xfrm flipV="1">
+                            <a:off x="3228975" y="499110"/>
+                            <a:ext cx="1340145" cy="5715"/>
+                          </a:xfrm>
+                          <a:prstGeom prst="line">
+                            <a:avLst/>
+                          </a:prstGeom>
+                        </wps:spPr>
+                        <wps:style>
+                          <a:lnRef idx="1">
+                            <a:schemeClr val="accent1"/>
+                          </a:lnRef>
+                          <a:fillRef idx="0">
+                            <a:schemeClr val="accent1"/>
+                          </a:fillRef>
+                          <a:effectRef idx="0">
+                            <a:schemeClr val="accent1"/>
+                          </a:effectRef>
+                          <a:fontRef idx="minor">
+                            <a:schemeClr val="tx1"/>
+                          </a:fontRef>
+                        </wps:style>
+                        <wps:bodyPr/>
+                      </wps:wsp>
+                      <wps:wsp>
+                        <wps:cNvPr id="17" name="Connecteur droit 17"/>
+                        <wps:cNvCnPr>
+                          <a:stCxn id="5" idx="0"/>
+                          <a:endCxn id="4" idx="2"/>
+                        </wps:cNvCnPr>
+                        <wps:spPr>
+                          <a:xfrm flipV="1">
+                            <a:off x="2789850" y="662940"/>
+                            <a:ext cx="0" cy="661012"/>
+                          </a:xfrm>
+                          <a:prstGeom prst="line">
+                            <a:avLst/>
+                          </a:prstGeom>
+                        </wps:spPr>
+                        <wps:style>
+                          <a:lnRef idx="1">
+                            <a:schemeClr val="accent1"/>
+                          </a:lnRef>
+                          <a:fillRef idx="0">
+                            <a:schemeClr val="accent1"/>
+                          </a:fillRef>
+                          <a:effectRef idx="0">
+                            <a:schemeClr val="accent1"/>
+                          </a:effectRef>
+                          <a:fontRef idx="minor">
+                            <a:schemeClr val="tx1"/>
+                          </a:fontRef>
+                        </wps:style>
+                        <wps:bodyPr/>
+                      </wps:wsp>
+                      <wps:wsp>
+                        <wps:cNvPr id="18" name="Zone de texte 10"/>
+                        <wps:cNvSpPr txBox="1"/>
+                        <wps:spPr>
+                          <a:xfrm>
+                            <a:off x="1037250" y="318112"/>
+                            <a:ext cx="401025" cy="274320"/>
+                          </a:xfrm>
+                          <a:prstGeom prst="rect">
+                            <a:avLst/>
+                          </a:prstGeom>
+                          <a:noFill/>
+                          <a:ln w="6350">
+                            <a:noFill/>
+                          </a:ln>
+                        </wps:spPr>
+                        <wps:txbx>
+                          <w:txbxContent>
+                            <w:p>
+                              <w:pPr>
+                                <w:pStyle w:val="NormalWeb"/>
+                                <w:spacing w:before="0" w:beforeAutospacing="0" w:after="160" w:afterAutospacing="0" w:line="256" w:lineRule="auto"/>
+                                <w:rPr>
+                                  <w:sz w:val="18"/>
+                                  <w:szCs w:val="18"/>
+                                </w:rPr>
+                              </w:pPr>
+                              <w:proofErr w:type="gramStart"/>
+                              <w:r>
+                                <w:rPr>
+                                  <w:rFonts w:ascii="Calibri" w:eastAsia="Calibri" w:hAnsi="Calibri"/>
+                                  <w:sz w:val="18"/>
+                                  <w:szCs w:val="18"/>
+                                </w:rPr>
+                                <w:t>0</w:t>
+                              </w:r>
+                              <w:r>
+                                <w:rPr>
+                                  <w:rFonts w:ascii="Calibri" w:eastAsia="Calibri" w:hAnsi="Calibri"/>
+                                  <w:sz w:val="18"/>
+                                  <w:szCs w:val="18"/>
+                                </w:rPr>
+                                <w:t>,n</w:t>
+                              </w:r>
+                              <w:proofErr w:type="gramEnd"/>
+                            </w:p>
+                          </w:txbxContent>
+                        </wps:txbx>
+                        <wps:bodyPr rot="0" spcFirstLastPara="0" vert="horz" wrap="square" lIns="91440" tIns="45720" rIns="91440" bIns="45720" numCol="1" spcCol="0" rtlCol="0" fromWordArt="0" anchor="t" anchorCtr="0" forceAA="0" compatLnSpc="1">
+                          <a:prstTxWarp prst="textNoShape">
+                            <a:avLst/>
+                          </a:prstTxWarp>
+                          <a:noAutofit/>
+                        </wps:bodyPr>
+                      </wps:wsp>
+                      <wps:wsp>
+                        <wps:cNvPr id="19" name="Zone de texte 10"/>
+                        <wps:cNvSpPr txBox="1"/>
+                        <wps:spPr>
+                          <a:xfrm>
+                            <a:off x="2103119" y="335280"/>
+                            <a:ext cx="400685" cy="274320"/>
+                          </a:xfrm>
+                          <a:prstGeom prst="rect">
+                            <a:avLst/>
+                          </a:prstGeom>
+                          <a:noFill/>
+                          <a:ln w="6350">
+                            <a:noFill/>
+                          </a:ln>
+                        </wps:spPr>
+                        <wps:txbx>
+                          <w:txbxContent>
+                            <w:p>
+                              <w:pPr>
+                                <w:pStyle w:val="NormalWeb"/>
+                                <w:spacing w:before="0" w:beforeAutospacing="0" w:after="160" w:afterAutospacing="0" w:line="254" w:lineRule="auto"/>
+                              </w:pPr>
+                              <w:r>
+                                <w:rPr>
+                                  <w:rFonts w:ascii="Calibri" w:eastAsia="Calibri" w:hAnsi="Calibri"/>
+                                  <w:sz w:val="18"/>
+                                  <w:szCs w:val="18"/>
+                                </w:rPr>
+                                <w:t>1,1</w:t>
+                              </w:r>
+                            </w:p>
+                          </w:txbxContent>
+                        </wps:txbx>
+                        <wps:bodyPr rot="0" spcFirstLastPara="0" vert="horz" wrap="square" lIns="91440" tIns="45720" rIns="91440" bIns="45720" numCol="1" spcCol="0" rtlCol="0" fromWordArt="0" anchor="t" anchorCtr="0" forceAA="0" compatLnSpc="1">
+                          <a:prstTxWarp prst="textNoShape">
+                            <a:avLst/>
+                          </a:prstTxWarp>
+                          <a:noAutofit/>
+                        </wps:bodyPr>
+                      </wps:wsp>
+                      <wps:wsp>
+                        <wps:cNvPr id="20" name="Zone de texte 10"/>
+                        <wps:cNvSpPr txBox="1"/>
+                        <wps:spPr>
+                          <a:xfrm>
+                            <a:off x="2523151" y="1142024"/>
+                            <a:ext cx="400685" cy="274320"/>
+                          </a:xfrm>
+                          <a:prstGeom prst="rect">
+                            <a:avLst/>
+                          </a:prstGeom>
+                          <a:noFill/>
+                          <a:ln w="6350">
+                            <a:noFill/>
+                          </a:ln>
+                        </wps:spPr>
+                        <wps:txbx>
+                          <w:txbxContent>
+                            <w:p>
+                              <w:pPr>
+                                <w:pStyle w:val="NormalWeb"/>
+                                <w:spacing w:before="0" w:beforeAutospacing="0" w:after="160" w:afterAutospacing="0" w:line="254" w:lineRule="auto"/>
+                              </w:pPr>
+                              <w:proofErr w:type="gramStart"/>
+                              <w:r>
+                                <w:rPr>
+                                  <w:rFonts w:ascii="Calibri" w:eastAsia="Calibri" w:hAnsi="Calibri"/>
+                                  <w:sz w:val="18"/>
+                                  <w:szCs w:val="18"/>
+                                </w:rPr>
+                                <w:t>0</w:t>
+                              </w:r>
+                              <w:r>
+                                <w:rPr>
+                                  <w:rFonts w:ascii="Calibri" w:eastAsia="Calibri" w:hAnsi="Calibri"/>
+                                  <w:sz w:val="18"/>
+                                  <w:szCs w:val="18"/>
+                                </w:rPr>
+                                <w:t>,n</w:t>
+                              </w:r>
+                              <w:proofErr w:type="gramEnd"/>
+                            </w:p>
+                          </w:txbxContent>
+                        </wps:txbx>
+                        <wps:bodyPr rot="0" spcFirstLastPara="0" vert="horz" wrap="square" lIns="91440" tIns="45720" rIns="91440" bIns="45720" numCol="1" spcCol="0" rtlCol="0" fromWordArt="0" anchor="t" anchorCtr="0" forceAA="0" compatLnSpc="1">
+                          <a:prstTxWarp prst="textNoShape">
+                            <a:avLst/>
+                          </a:prstTxWarp>
+                          <a:noAutofit/>
+                        </wps:bodyPr>
+                      </wps:wsp>
+                      <wps:wsp>
+                        <wps:cNvPr id="21" name="Zone de texte 10"/>
+                        <wps:cNvSpPr txBox="1"/>
+                        <wps:spPr>
+                          <a:xfrm>
+                            <a:off x="2537437" y="609600"/>
+                            <a:ext cx="400685" cy="274320"/>
+                          </a:xfrm>
+                          <a:prstGeom prst="rect">
+                            <a:avLst/>
+                          </a:prstGeom>
+                          <a:noFill/>
+                          <a:ln w="6350">
+                            <a:noFill/>
+                          </a:ln>
+                        </wps:spPr>
+                        <wps:txbx>
+                          <w:txbxContent>
+                            <w:p>
+                              <w:pPr>
+                                <w:pStyle w:val="NormalWeb"/>
+                                <w:spacing w:before="0" w:beforeAutospacing="0" w:after="160" w:afterAutospacing="0" w:line="252" w:lineRule="auto"/>
+                              </w:pPr>
+                              <w:r>
+                                <w:rPr>
+                                  <w:rFonts w:ascii="Calibri" w:eastAsia="Calibri" w:hAnsi="Calibri"/>
+                                  <w:sz w:val="18"/>
+                                  <w:szCs w:val="18"/>
+                                </w:rPr>
+                                <w:t>1,1</w:t>
+                              </w:r>
+                            </w:p>
+                          </w:txbxContent>
+                        </wps:txbx>
+                        <wps:bodyPr rot="0" spcFirstLastPara="0" vert="horz" wrap="square" lIns="91440" tIns="45720" rIns="91440" bIns="45720" numCol="1" spcCol="0" rtlCol="0" fromWordArt="0" anchor="t" anchorCtr="0" forceAA="0" compatLnSpc="1">
+                          <a:prstTxWarp prst="textNoShape">
+                            <a:avLst/>
+                          </a:prstTxWarp>
+                          <a:noAutofit/>
+                        </wps:bodyPr>
+                      </wps:wsp>
+                      <wps:wsp>
+                        <wps:cNvPr id="22" name="Zone de texte 10"/>
+                        <wps:cNvSpPr txBox="1"/>
+                        <wps:spPr>
+                          <a:xfrm>
+                            <a:off x="3151800" y="341925"/>
+                            <a:ext cx="400685" cy="274320"/>
+                          </a:xfrm>
+                          <a:prstGeom prst="rect">
+                            <a:avLst/>
+                          </a:prstGeom>
+                          <a:noFill/>
+                          <a:ln w="6350">
+                            <a:noFill/>
+                          </a:ln>
+                        </wps:spPr>
+                        <wps:txbx>
+                          <w:txbxContent>
+                            <w:p>
+                              <w:pPr>
+                                <w:pStyle w:val="NormalWeb"/>
+                                <w:spacing w:before="0" w:beforeAutospacing="0" w:after="160" w:afterAutospacing="0" w:line="252" w:lineRule="auto"/>
+                              </w:pPr>
+                              <w:proofErr w:type="gramStart"/>
+                              <w:r>
+                                <w:rPr>
+                                  <w:rFonts w:ascii="Calibri" w:eastAsia="Calibri" w:hAnsi="Calibri"/>
+                                  <w:sz w:val="18"/>
+                                  <w:szCs w:val="18"/>
+                                </w:rPr>
+                                <w:t>0,n</w:t>
+                              </w:r>
+                              <w:proofErr w:type="gramEnd"/>
+                            </w:p>
+                          </w:txbxContent>
+                        </wps:txbx>
+                        <wps:bodyPr rot="0" spcFirstLastPara="0" vert="horz" wrap="square" lIns="91440" tIns="45720" rIns="91440" bIns="45720" numCol="1" spcCol="0" rtlCol="0" fromWordArt="0" anchor="t" anchorCtr="0" forceAA="0" compatLnSpc="1">
+                          <a:prstTxWarp prst="textNoShape">
+                            <a:avLst/>
+                          </a:prstTxWarp>
+                          <a:noAutofit/>
+                        </wps:bodyPr>
+                      </wps:wsp>
+                      <wps:wsp>
+                        <wps:cNvPr id="23" name="Zone de texte 10"/>
+                        <wps:cNvSpPr txBox="1"/>
+                        <wps:spPr>
+                          <a:xfrm>
+                            <a:off x="4299562" y="341925"/>
+                            <a:ext cx="400685" cy="274320"/>
+                          </a:xfrm>
+                          <a:prstGeom prst="rect">
+                            <a:avLst/>
+                          </a:prstGeom>
+                          <a:noFill/>
+                          <a:ln w="6350">
+                            <a:noFill/>
+                          </a:ln>
+                        </wps:spPr>
+                        <wps:txbx>
+                          <w:txbxContent>
+                            <w:p>
+                              <w:pPr>
+                                <w:pStyle w:val="NormalWeb"/>
+                                <w:spacing w:before="0" w:beforeAutospacing="0" w:after="160" w:afterAutospacing="0" w:line="252" w:lineRule="auto"/>
+                              </w:pPr>
+                              <w:r>
+                                <w:rPr>
+                                  <w:rFonts w:ascii="Calibri" w:eastAsia="Calibri" w:hAnsi="Calibri"/>
+                                  <w:sz w:val="18"/>
+                                  <w:szCs w:val="18"/>
+                                </w:rPr>
+                                <w:t>1</w:t>
+                              </w:r>
+                              <w:r>
+                                <w:rPr>
+                                  <w:rFonts w:ascii="Calibri" w:eastAsia="Calibri" w:hAnsi="Calibri"/>
+                                  <w:sz w:val="18"/>
+                                  <w:szCs w:val="18"/>
+                                </w:rPr>
+                                <w:t>,1</w:t>
+                              </w:r>
+                            </w:p>
+                          </w:txbxContent>
+                        </wps:txbx>
+                        <wps:bodyPr rot="0" spcFirstLastPara="0" vert="horz" wrap="square" lIns="91440" tIns="45720" rIns="91440" bIns="45720" numCol="1" spcCol="0" rtlCol="0" fromWordArt="0" anchor="t" anchorCtr="0" forceAA="0" compatLnSpc="1">
+                          <a:prstTxWarp prst="textNoShape">
+                            <a:avLst/>
+                          </a:prstTxWarp>
+                          <a:noAutofit/>
+                        </wps:bodyPr>
+                      </wps:wsp>
+                    </wpc:wpc>
+                  </a:graphicData>
+                </a:graphic>
+              </wp:inline>
+            </w:drawing>
+          </mc:Choice>
+          <mc:Fallback>
+            <w:pict>
+              <v:group id="Zone de dessin 1" o:spid="_x0000_s1026" editas="canvas" style="width:6in;height:137.6pt;mso-position-horizontal-relative:char;mso-position-vertical-relative:line" coordsize="54864,17475" o:gfxdata="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">
+                <v:shapetype id="_x0000_t75" coordsize="21600,21600" o:spt="75" o:preferrelative="t" path="m@4@5l@4@11@9@11@9@5xe" filled="f" stroked="f">
+                  <v:stroke joinstyle="miter"/>
+                  <v:formulas>
+                    <v:f eqn="if lineDrawn pixelLineWidth 0"/>
+                    <v:f eqn="sum @0 1 0"/>
+                    <v:f eqn="sum 0 0 @1"/>
+                    <v:f eqn="prod @2 1 2"/>
+                    <v:f eqn="prod @3 21600 pixelWidth"/>
+                    <v:f eqn="prod @3 21600 pixelHeight"/>
+                    <v:f eqn="sum @0 0 1"/>
+                    <v:f eqn="prod @6 1 2"/>
+                    <v:f eqn="prod @7 21600 pixelWidth"/>
+                    <v:f eqn="sum @8 21600 0"/>
+                    <v:f eqn="prod @7 21600 pixelHeight"/>
+                    <v:f eqn="sum @10 21600 0"/>
+                  </v:formulas>
+                  <v:path o:extrusionok="f" gradientshapeok="t" o:connecttype="rect"/>
+                  <o:lock v:ext="edit" aspectratio="t"/>
+                </v:shapetype>
+                <v:shape id="_x0000_s1027" type="#_x0000_t75" style="position:absolute;width:54864;height:17475;visibility:visible;mso-wrap-style:square">
+                  <v:fill o:detectmouseclick="t"/>
+                  <v:path o:connecttype="none"/>
+                </v:shape>
+                <v:shapetype id="_x0000_t202" coordsize="21600,21600" o:spt="202" path="m,l,21600r21600,l21600,xe">
+                  <v:stroke joinstyle="miter"/>
+                  <v:path gradientshapeok="t" o:connecttype="rect"/>
+                </v:shapetype>
+                <v:shape id="Zone de texte 2" o:spid="_x0000_s1028" type="#_x0000_t202" style="position:absolute;left:2514;top:3352;width:8611;height:3277;visibility:visible;mso-wrap-style:square;v-text-anchor:top" o:gfxdata="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" fillcolor="white [3201]" strokeweight=".5pt">
+                  <v:textbox>
+                    <w:txbxContent>
+                      <w:p>
+                        <w:r>
+                          <w:t>Utilisateur</w:t>
+                        </w:r>
+                      </w:p>
+                    </w:txbxContent>
+                  </v:textbox>
+                </v:shape>
+                <v:shape id="Zone de texte 2" o:spid="_x0000_s1029" type="#_x0000_t202" style="position:absolute;left:23593;top:3352;width:8610;height:3277;visibility:visible;mso-wrap-style:square;v-text-anchor:top" o:gfxdata="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" fillcolor="white [3201]" strokeweight=".5pt">
+                  <v:textbox>
+                    <w:txbxContent>
+                      <w:p>
+                        <w:pPr>
+                          <w:pStyle w:val="NormalWeb"/>
+                          <w:spacing w:before="0" w:beforeAutospacing="0" w:after="160" w:afterAutospacing="0" w:line="256" w:lineRule="auto"/>
+                        </w:pPr>
+                        <w:r>
+                          <w:rPr>
+                            <w:rFonts w:ascii="Calibri" w:eastAsia="Calibri" w:hAnsi="Calibri"/>
+                            <w:sz w:val="22"/>
+                            <w:szCs w:val="22"/>
+                          </w:rPr>
+                          <w:t>Exemplaire</w:t>
+                        </w:r>
+                      </w:p>
+                    </w:txbxContent>
+                  </v:textbox>
+                </v:shape>
+                <v:shape id="Zone de texte 2" o:spid="_x0000_s1030" type="#_x0000_t202" style="position:absolute;left:23593;top:13239;width:8610;height:3277;visibility:visible;mso-wrap-style:square;v-text-anchor:top" o:gfxdata="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" fillcolor="white [3201]" strokeweight=".5pt">
+                  <v:textbox>
+                    <w:txbxContent>
+                      <w:p>
+                        <w:pPr>
+                          <w:pStyle w:val="NormalWeb"/>
+                          <w:spacing w:before="0" w:beforeAutospacing="0" w:after="160" w:afterAutospacing="0" w:line="254" w:lineRule="auto"/>
+                        </w:pPr>
+                        <w:r>
+                          <w:rPr>
+                            <w:rFonts w:ascii="Calibri" w:eastAsia="Calibri" w:hAnsi="Calibri"/>
+                            <w:sz w:val="22"/>
+                            <w:szCs w:val="22"/>
+                          </w:rPr>
+                          <w:t>Livre</w:t>
+                        </w:r>
+                      </w:p>
+                    </w:txbxContent>
+                  </v:textbox>
+                </v:shape>
+                <v:shape id="Zone de texte 2" o:spid="_x0000_s1031" type="#_x0000_t202" style="position:absolute;left:45691;top:3352;width:8610;height:3277;visibility:visible;mso-wrap-style:square;v-text-anchor:top" o:gfxdata="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" fillcolor="white [3201]" strokeweight=".5pt">
+                  <v:textbox>
+                    <w:txbxContent>
+                      <w:p>
+                        <w:pPr>
+                          <w:pStyle w:val="NormalWeb"/>
+                          <w:spacing w:before="0" w:beforeAutospacing="0" w:after="160" w:afterAutospacing="0" w:line="252" w:lineRule="auto"/>
+                        </w:pPr>
+                        <w:r>
+                          <w:rPr>
+                            <w:rFonts w:ascii="Calibri" w:eastAsia="Calibri" w:hAnsi="Calibri"/>
+                            <w:sz w:val="22"/>
+                            <w:szCs w:val="22"/>
+                          </w:rPr>
+                          <w:t>Emprunts</w:t>
+                        </w:r>
+                      </w:p>
+                    </w:txbxContent>
+                  </v:textbox>
+                </v:shape>
+                <v:shape id="Zone de texte 10" o:spid="_x0000_s1032" type="#_x0000_t202" style="position:absolute;left:13792;top:5410;width:8001;height:2743;visibility:visible;mso-wrap-style:square;v-text-anchor:top" o:gfxdata="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" filled="f" stroked="f" strokeweight=".5pt">
+                  <v:textbox>
+                    <w:txbxContent>
+                      <w:p>
+                        <w:r>
+                          <w:t>Possède</w:t>
+                        </w:r>
+                      </w:p>
+                    </w:txbxContent>
+                  </v:textbox>
+                </v:shape>
+                <v:shape id="Zone de texte 10" o:spid="_x0000_s1033" type="#_x0000_t202" style="position:absolute;left:27555;top:9191;width:14497;height:2743;visibility:visible;mso-wrap-style:square;v-text-anchor:top" o:gfxdata="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" filled="f" stroked="f" strokeweight=".5pt">
+                  <v:textbox>
+                    <w:txbxContent>
+                      <w:p>
+                        <w:pPr>
+                          <w:pStyle w:val="NormalWeb"/>
+                          <w:spacing w:before="0" w:beforeAutospacing="0" w:after="160" w:afterAutospacing="0" w:line="256" w:lineRule="auto"/>
+                        </w:pPr>
+                        <w:r>
+                          <w:rPr>
+                            <w:rFonts w:ascii="Calibri" w:eastAsia="Calibri" w:hAnsi="Calibri"/>
+                            <w:sz w:val="22"/>
+                            <w:szCs w:val="22"/>
+                          </w:rPr>
+                          <w:t>Est un exemplaire de</w:t>
+                        </w:r>
+                      </w:p>
+                    </w:txbxContent>
+                  </v:textbox>
+                </v:shape>
+                <v:shape id="Zone de texte 10" o:spid="_x0000_s1034" type="#_x0000_t202" style="position:absolute;left:34185;top:4543;width:11230;height:4458;visibility:visible;mso-wrap-style:square;v-text-anchor:top" o:gfxdata="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" filled="f" stroked="f" strokeweight=".5pt">
+                  <v:textbox>
+                    <w:txbxContent>
+                      <w:p>
+                        <w:pPr>
+                          <w:pStyle w:val="NormalWeb"/>
+                          <w:spacing w:before="0" w:beforeAutospacing="0" w:after="160" w:afterAutospacing="0" w:line="254" w:lineRule="auto"/>
+                        </w:pPr>
+                        <w:r>
+                          <w:rPr>
+                            <w:rFonts w:ascii="Calibri" w:eastAsia="Calibri" w:hAnsi="Calibri"/>
+                            <w:sz w:val="22"/>
+                            <w:szCs w:val="22"/>
+                          </w:rPr>
+                          <w:t>Fait l’objet d’un emprunt</w:t>
+                        </w:r>
+                      </w:p>
+                    </w:txbxContent>
+                  </v:textbox>
+                </v:shape>
+                <v:line id="Connecteur droit 15" o:spid="_x0000_s1035" style="position:absolute;visibility:visible;mso-wrap-style:square" from="11125,4991" to="23593,4991" o:connectortype="straight" o:gfxdata="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" strokecolor="#5b9bd5 [3204]" strokeweight=".5pt">
+                  <v:stroke joinstyle="miter"/>
+                </v:line>
+                <v:line id="Connecteur droit 16" o:spid="_x0000_s1036" style="position:absolute;flip:y;visibility:visible;mso-wrap-style:square" from="32289,4991" to="45691,5048" o:connectortype="straight" o:gfxdata="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" strokecolor="#5b9bd5 [3204]" strokeweight=".5pt">
+                  <v:stroke joinstyle="miter"/>
+                </v:line>
+                <v:line id="Connecteur droit 17" o:spid="_x0000_s1037" style="position:absolute;flip:y;visibility:visible;mso-wrap-style:square" from="27898,6629" to="27898,13239" o:connectortype="straight" o:gfxdata="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" strokecolor="#5b9bd5 [3204]" strokeweight=".5pt">
+                  <v:stroke joinstyle="miter"/>
+                </v:line>
+                <v:shape id="Zone de texte 10" o:spid="_x0000_s1038" type="#_x0000_t202" style="position:absolute;left:10372;top:3181;width:4010;height:2743;visibility:visible;mso-wrap-style:square;v-text-anchor:top" o:gfxdata="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" filled="f" stroked="f" strokeweight=".5pt">
+                  <v:textbox>
+                    <w:txbxContent>
+                      <w:p>
+                        <w:pPr>
+                          <w:pStyle w:val="NormalWeb"/>
+                          <w:spacing w:before="0" w:beforeAutospacing="0" w:after="160" w:afterAutospacing="0" w:line="256" w:lineRule="auto"/>
+                          <w:rPr>
+                            <w:sz w:val="18"/>
+                            <w:szCs w:val="18"/>
+                          </w:rPr>
+                        </w:pPr>
+                        <w:proofErr w:type="gramStart"/>
+                        <w:r>
+                          <w:rPr>
+                            <w:rFonts w:ascii="Calibri" w:eastAsia="Calibri" w:hAnsi="Calibri"/>
+                            <w:sz w:val="18"/>
+                            <w:szCs w:val="18"/>
+                          </w:rPr>
+                          <w:t>0</w:t>
+                        </w:r>
+                        <w:r>
+                          <w:rPr>
+                            <w:rFonts w:ascii="Calibri" w:eastAsia="Calibri" w:hAnsi="Calibri"/>
+                            <w:sz w:val="18"/>
+                            <w:szCs w:val="18"/>
+                          </w:rPr>
+                          <w:t>,n</w:t>
+                        </w:r>
+                        <w:proofErr w:type="gramEnd"/>
+                      </w:p>
+                    </w:txbxContent>
+                  </v:textbox>
+                </v:shape>
+                <v:shape id="Zone de texte 10" o:spid="_x0000_s1039" type="#_x0000_t202" style="position:absolute;left:21031;top:3352;width:4007;height:2744;visibility:visible;mso-wrap-style:square;v-text-anchor:top" o:gfxdata="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" filled="f" stroked="f" strokeweight=".5pt">
+                  <v:textbox>
+                    <w:txbxContent>
+                      <w:p>
+                        <w:pPr>
+                          <w:pStyle w:val="NormalWeb"/>
+                          <w:spacing w:before="0" w:beforeAutospacing="0" w:after="160" w:afterAutospacing="0" w:line="254" w:lineRule="auto"/>
+                        </w:pPr>
+                        <w:r>
+                          <w:rPr>
+                            <w:rFonts w:ascii="Calibri" w:eastAsia="Calibri" w:hAnsi="Calibri"/>
+                            <w:sz w:val="18"/>
+                            <w:szCs w:val="18"/>
+                          </w:rPr>
+                          <w:t>1,1</w:t>
+                        </w:r>
+                      </w:p>
+                    </w:txbxContent>
+                  </v:textbox>
+                </v:shape>
+                <v:shape id="Zone de texte 10" o:spid="_x0000_s1040" type="#_x0000_t202" style="position:absolute;left:25231;top:11420;width:4007;height:2743;visibility:visible;mso-wrap-style:square;v-text-anchor:top" o:gfxdata="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" filled="f" stroked="f" strokeweight=".5pt">
+                  <v:textbox>
+                    <w:txbxContent>
+                      <w:p>
+                        <w:pPr>
+                          <w:pStyle w:val="NormalWeb"/>
+                          <w:spacing w:before="0" w:beforeAutospacing="0" w:after="160" w:afterAutospacing="0" w:line="254" w:lineRule="auto"/>
+                        </w:pPr>
+                        <w:proofErr w:type="gramStart"/>
+                        <w:r>
+                          <w:rPr>
+                            <w:rFonts w:ascii="Calibri" w:eastAsia="Calibri" w:hAnsi="Calibri"/>
+                            <w:sz w:val="18"/>
+                            <w:szCs w:val="18"/>
+                          </w:rPr>
+                          <w:t>0</w:t>
+                        </w:r>
+                        <w:r>
+                          <w:rPr>
+                            <w:rFonts w:ascii="Calibri" w:eastAsia="Calibri" w:hAnsi="Calibri"/>
+                            <w:sz w:val="18"/>
+                            <w:szCs w:val="18"/>
+                          </w:rPr>
+                          <w:t>,n</w:t>
+                        </w:r>
+                        <w:proofErr w:type="gramEnd"/>
+                      </w:p>
+                    </w:txbxContent>
+                  </v:textbox>
+                </v:shape>
+                <v:shape id="Zone de texte 10" o:spid="_x0000_s1041" type="#_x0000_t202" style="position:absolute;left:25374;top:6096;width:4007;height:2743;visibility:visible;mso-wrap-style:square;v-text-anchor:top" o:gfxdata="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" filled="f" stroked="f" strokeweight=".5pt">
+                  <v:textbox>
+                    <w:txbxContent>
+                      <w:p>
+                        <w:pPr>
+                          <w:pStyle w:val="NormalWeb"/>
+                          <w:spacing w:before="0" w:beforeAutospacing="0" w:after="160" w:afterAutospacing="0" w:line="252" w:lineRule="auto"/>
+                        </w:pPr>
+                        <w:r>
+                          <w:rPr>
+                            <w:rFonts w:ascii="Calibri" w:eastAsia="Calibri" w:hAnsi="Calibri"/>
+                            <w:sz w:val="18"/>
+                            <w:szCs w:val="18"/>
+                          </w:rPr>
+                          <w:t>1,1</w:t>
+                        </w:r>
+                      </w:p>
+                    </w:txbxContent>
+                  </v:textbox>
+                </v:shape>
+                <v:shape id="Zone de texte 10" o:spid="_x0000_s1042" type="#_x0000_t202" style="position:absolute;left:31518;top:3419;width:4006;height:2743;visibility:visible;mso-wrap-style:square;v-text-anchor:top" o:gfxdata="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" filled="f" stroked="f" strokeweight=".5pt">
+                  <v:textbox>
+                    <w:txbxContent>
+                      <w:p>
+                        <w:pPr>
+                          <w:pStyle w:val="NormalWeb"/>
+                          <w:spacing w:before="0" w:beforeAutospacing="0" w:after="160" w:afterAutospacing="0" w:line="252" w:lineRule="auto"/>
+                        </w:pPr>
+                        <w:proofErr w:type="gramStart"/>
+                        <w:r>
+                          <w:rPr>
+                            <w:rFonts w:ascii="Calibri" w:eastAsia="Calibri" w:hAnsi="Calibri"/>
+                            <w:sz w:val="18"/>
+                            <w:szCs w:val="18"/>
+                          </w:rPr>
+                          <w:t>0,n</w:t>
+                        </w:r>
+                        <w:proofErr w:type="gramEnd"/>
+                      </w:p>
+                    </w:txbxContent>
+                  </v:textbox>
+                </v:shape>
+                <v:shape id="Zone de texte 10" o:spid="_x0000_s1043" type="#_x0000_t202" style="position:absolute;left:42995;top:3419;width:4007;height:2743;visibility:visible;mso-wrap-style:square;v-text-anchor:top" o:gfxdata="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" filled="f" stroked="f" strokeweight=".5pt">
+                  <v:textbox>
+                    <w:txbxContent>
+                      <w:p>
+                        <w:pPr>
+                          <w:pStyle w:val="NormalWeb"/>
+                          <w:spacing w:before="0" w:beforeAutospacing="0" w:after="160" w:afterAutospacing="0" w:line="252" w:lineRule="auto"/>
+                        </w:pPr>
+                        <w:r>
+                          <w:rPr>
+                            <w:rFonts w:ascii="Calibri" w:eastAsia="Calibri" w:hAnsi="Calibri"/>
+                            <w:sz w:val="18"/>
+                            <w:szCs w:val="18"/>
+                          </w:rPr>
+                          <w:t>1</w:t>
+                        </w:r>
+                        <w:r>
+                          <w:rPr>
+                            <w:rFonts w:ascii="Calibri" w:eastAsia="Calibri" w:hAnsi="Calibri"/>
+                            <w:sz w:val="18"/>
+                            <w:szCs w:val="18"/>
+                          </w:rPr>
+                          <w:t>,1</w:t>
+                        </w:r>
+                      </w:p>
+                    </w:txbxContent>
+                  </v:textbox>
+                </v:shape>
+                <w10:anchorlock/>
+              </v:group>
+            </w:pict>
+          </mc:Fallback>
+        </mc:AlternateContent>
+      </w:r>
+    </w:p>
+    <w:p>
+      <w:r>
+        <w:t xml:space="preserve">MLD : traduction relationnelle avec PK (# clé primaire) et </w:t>
+      </w:r>
+      <w:proofErr w:type="gramStart"/>
+      <w:r>
+        <w:t>FK(</w:t>
+      </w:r>
+      <w:proofErr w:type="gramEnd"/>
+      <w:r>
+        <w:t>* clé étrangère)</w:t>
+      </w:r>
+      <w:r>
+        <w:t xml:space="preserve">. </w:t>
+      </w:r>
+    </w:p>
+    <w:p>
+      <w:r>
+        <w:rPr>
+          <w:noProof/>
+          <w:lang w:eastAsia="fr-FR"/>
+        </w:rPr>
+        <w:drawing>
+          <wp:anchor distT="0" distB="0" distL="114300" distR="114300" simplePos="0" relativeHeight="251659264" behindDoc="0" locked="0" layoutInCell="1" allowOverlap="1">
+            <wp:simplePos x="0" y="0"/>
+            <wp:positionH relativeFrom="column">
+              <wp:posOffset>1905</wp:posOffset>
+            </wp:positionH>
+            <wp:positionV relativeFrom="paragraph">
+              <wp:posOffset>0</wp:posOffset>
+            </wp:positionV>
+            <wp:extent cx="5760720" cy="3246120"/>
+            <wp:effectExtent l="0" t="0" r="0" b="0"/>
+            <wp:wrapSquare wrapText="bothSides"/>
+            <wp:docPr id="26" name="Image 26"/>
+            <wp:cNvGraphicFramePr>
+              <a:graphicFrameLocks xmlns:a="http://schemas.openxmlformats.org/drawingml/2006/main" noChangeAspect="1"/>
+            </wp:cNvGraphicFramePr>
+            <a:graphic xmlns:a="http://schemas.openxmlformats.org/drawingml/2006/main">
+              <a:graphicData uri="http://schemas.openxmlformats.org/drawingml/2006/picture">
+                <pic:pic xmlns:pic="http://schemas.openxmlformats.org/drawingml/2006/picture">
+                  <pic:nvPicPr>
+                    <pic:cNvPr id="1" name=""/>
+                    <pic:cNvPicPr/>
+                  </pic:nvPicPr>
+                  <pic:blipFill>
+                    <a:blip r:embed="rId5">
+                      <a:extLst>
+                        <a:ext uri="{28A0092B-C50C-407E-A947-70E740481C1C}">
+                          <a14:useLocalDpi xmlns:a14="http://schemas.microsoft.com/office/drawing/2010/main" val="0"/>
+                        </a:ext>
+                      </a:extLst>
+                    </a:blip>
+                    <a:stretch>
+                      <a:fillRect/>
+                    </a:stretch>
+                  </pic:blipFill>
+                  <pic:spPr>
+                    <a:xfrm>
+                      <a:off x="0" y="0"/>
+                      <a:ext cx="5760720" cy="3246120"/>
+                    </a:xfrm>
+                    <a:prstGeom prst="rect">
+                      <a:avLst/>
+                    </a:prstGeom>
+                  </pic:spPr>
+                </pic:pic>
+              </a:graphicData>
+            </a:graphic>
+            <wp14:sizeRelH relativeFrom="page">
+              <wp14:pctWidth>0</wp14:pctWidth>
+            </wp14:sizeRelH>
+            <wp14:sizeRelV relativeFrom="page">
+              <wp14:pctHeight>0</wp14:pctHeight>
+            </wp14:sizeRelV>
+          </wp:anchor>
+        </w:drawing>
+      </w:r>
+    </w:p>
+    <w:p/>
+    <w:p>
+      <w:r>
+        <w:rPr>
+          <w:noProof/>
+          <w:lang w:eastAsia="fr-FR"/>
+        </w:rPr>
+        <w:drawing>
+          <wp:anchor distT="0" distB="0" distL="114300" distR="114300" simplePos="0" relativeHeight="251660288" behindDoc="0" locked="0" layoutInCell="1" allowOverlap="1" wp14:anchorId="4674AB2A" wp14:editId="04D741DA">
+            <wp:simplePos x="0" y="0"/>
+            <wp:positionH relativeFrom="margin">
+              <wp:align>right</wp:align>
+            </wp:positionH>
+            <wp:positionV relativeFrom="paragraph">
+              <wp:posOffset>208280</wp:posOffset>
+            </wp:positionV>
+            <wp:extent cx="5753100" cy="2703195"/>
+            <wp:effectExtent l="0" t="0" r="0" b="1905"/>
+            <wp:wrapSquare wrapText="bothSides"/>
+            <wp:docPr id="27" name="Image 27"/>
+            <wp:cNvGraphicFramePr>
+              <a:graphicFrameLocks xmlns:a="http://schemas.openxmlformats.org/drawingml/2006/main" noChangeAspect="1"/>
+            </wp:cNvGraphicFramePr>
+            <a:graphic xmlns:a="http://schemas.openxmlformats.org/drawingml/2006/main">
+              <a:graphicData uri="http://schemas.openxmlformats.org/drawingml/2006/picture">
+                <pic:pic xmlns:pic="http://schemas.openxmlformats.org/drawingml/2006/picture">
+                  <pic:nvPicPr>
+                    <pic:cNvPr id="1" name=""/>
+                    <pic:cNvPicPr/>
+                  </pic:nvPicPr>
+                  <pic:blipFill>
+                    <a:blip r:embed="rId6">
+                      <a:extLst>
+                        <a:ext uri="{28A0092B-C50C-407E-A947-70E740481C1C}">
+                          <a14:useLocalDpi xmlns:a14="http://schemas.microsoft.com/office/drawing/2010/main" val="0"/>
+                        </a:ext>
+                      </a:extLst>
+                    </a:blip>
+                    <a:stretch>
+                      <a:fillRect/>
+                    </a:stretch>
+                  </pic:blipFill>
+                  <pic:spPr>
+                    <a:xfrm>
+                      <a:off x="0" y="0"/>
+                      <a:ext cx="5753100" cy="2703195"/>
+                    </a:xfrm>
+                    <a:prstGeom prst="rect">
+                      <a:avLst/>
+                    </a:prstGeom>
+                  </pic:spPr>
+                </pic:pic>
+              </a:graphicData>
+            </a:graphic>
+            <wp14:sizeRelH relativeFrom="page">
+              <wp14:pctWidth>0</wp14:pctWidth>
+            </wp14:sizeRelH>
+            <wp14:sizeRelV relativeFrom="page">
+              <wp14:pctHeight>0</wp14:pctHeight>
+            </wp14:sizeRelV>
+          </wp:anchor>
+        </w:drawing>
+      </w:r>
+      <w:r>
+        <w:t>MPD : avec les types de variables SQL</w:t>
+      </w:r>
+      <w:r>
+        <w:t>.</w:t>
+      </w:r>
+    </w:p>
+    <w:p>
+      <w:r>
+        <w:lastRenderedPageBreak/>
+        <w:t>REM : oublie de la photo dans la table Utilisateur, même raisonnement que pour la couverture, on va stocker le chemin de la localisation de photo</w:t>
+      </w:r>
+    </w:p>
+    <w:p>
+      <w:r>
+        <w:drawing>
+          <wp:anchor distT="0" distB="0" distL="114300" distR="114300" simplePos="0" relativeHeight="251658240" behindDoc="0" locked="0" layoutInCell="1" allowOverlap="1" wp14:anchorId="3A4F3153" wp14:editId="0B2407EF">
+            <wp:simplePos x="0" y="0"/>
+            <wp:positionH relativeFrom="margin">
+              <wp:posOffset>-556895</wp:posOffset>
+            </wp:positionH>
+            <wp:positionV relativeFrom="paragraph">
+              <wp:posOffset>318770</wp:posOffset>
+            </wp:positionV>
+            <wp:extent cx="6858000" cy="3114675"/>
+            <wp:effectExtent l="0" t="0" r="0" b="9525"/>
+            <wp:wrapSquare wrapText="bothSides"/>
+            <wp:docPr id="3" name="Image 3"/>
+            <wp:cNvGraphicFramePr>
+              <a:graphicFrameLocks xmlns:a="http://schemas.openxmlformats.org/drawingml/2006/main" noChangeAspect="1"/>
+            </wp:cNvGraphicFramePr>
+            <a:graphic xmlns:a="http://schemas.openxmlformats.org/drawingml/2006/main">
+              <a:graphicData uri="http://schemas.openxmlformats.org/drawingml/2006/picture">
+                <pic:pic xmlns:pic="http://schemas.openxmlformats.org/drawingml/2006/picture">
+                  <pic:nvPicPr>
+                    <pic:cNvPr id="1" name=""/>
+                    <pic:cNvPicPr/>
+                  </pic:nvPicPr>
+                  <pic:blipFill>
+                    <a:blip r:embed="rId7" cstate="print">
+                      <a:extLst>
+                        <a:ext uri="{28A0092B-C50C-407E-A947-70E740481C1C}">
+                          <a14:useLocalDpi xmlns:a14="http://schemas.microsoft.com/office/drawing/2010/main" val="0"/>
+                        </a:ext>
+                      </a:extLst>
+                    </a:blip>
+                    <a:stretch>
+                      <a:fillRect/>
+                    </a:stretch>
+                  </pic:blipFill>
+                  <pic:spPr>
+                    <a:xfrm>
+                      <a:off x="0" y="0"/>
+                      <a:ext cx="6858000" cy="3114675"/>
+                    </a:xfrm>
+                    <a:prstGeom prst="rect">
+                      <a:avLst/>
+                    </a:prstGeom>
+                  </pic:spPr>
+                </pic:pic>
+              </a:graphicData>
+            </a:graphic>
+            <wp14:sizeRelH relativeFrom="page">
+              <wp14:pctWidth>0</wp14:pctWidth>
+            </wp14:sizeRelH>
+            <wp14:sizeRelV relativeFrom="page">
+              <wp14:pctHeight>0</wp14:pctHeight>
+            </wp14:sizeRelV>
+          </wp:anchor>
+        </w:drawing>
+      </w:r>
+      <w:r>
+        <w:t xml:space="preserve">Utilisation de </w:t>
+      </w:r>
+      <w:proofErr w:type="spellStart"/>
+      <w:r>
+        <w:t>MyPHPAdmin</w:t>
+      </w:r>
+      <w:proofErr w:type="spellEnd"/>
+      <w:r>
+        <w:t xml:space="preserve"> pour construire le </w:t>
+      </w:r>
+      <w:proofErr w:type="spellStart"/>
+      <w:r>
+        <w:t>sql</w:t>
+      </w:r>
+      <w:proofErr w:type="spellEnd"/>
+      <w:r>
+        <w:t xml:space="preserve"> via XAMPP. </w:t>
+      </w:r>
+    </w:p>
+    <w:p/>
+    <w:p>
       <w:bookmarkStart w:id="0" w:name="_GoBack"/>
       <w:bookmarkEnd w:id="0"/>
-      <w:r>
-        <w:t xml:space="preserve"> sans doublon car cela peut mener à des erreurs. </w:t>
-      </w:r>
-    </w:p>
-    <w:p/>
-    <w:p/>
+    </w:p>
     <w:sectPr>
       <w:pgSz w:w="11906" w:h="16838"/>
       <w:pgMar w:top="1417" w:right="1417" w:bottom="1417" w:left="1417" w:header="708" w:footer="708" w:gutter="0"/>
@@ -1987,6 +3255,23 @@
       </w:tblBorders>
     </w:tblPr>
   </w:style>
+  <w:style w:type="paragraph" w:styleId="NormalWeb">
+    <w:name w:val="Normal (Web)"/>
+    <w:basedOn w:val="Normal"/>
+    <w:uiPriority w:val="99"/>
+    <w:semiHidden/>
+    <w:unhideWhenUsed/>
+    <w:rsid w:val="006F22AF"/>
+    <w:pPr>
+      <w:spacing w:before="100" w:beforeAutospacing="1" w:after="100" w:afterAutospacing="1" w:line="240" w:lineRule="auto"/>
+    </w:pPr>
+    <w:rPr>
+      <w:rFonts w:ascii="Times New Roman" w:eastAsiaTheme="minorEastAsia" w:hAnsi="Times New Roman" w:cs="Times New Roman"/>
+      <w:sz w:val="24"/>
+      <w:szCs w:val="24"/>
+      <w:lang w:eastAsia="fr-FR"/>
+    </w:rPr>
+  </w:style>
 </w:styles>
 </file>
 

</xml_diff>

<commit_message>
feat : mise en place affichage dynamique des livres
</commit_message>
<xml_diff>
--- a/docs/XX_EP_Journal_de_Bord.docx
+++ b/docs/XX_EP_Journal_de_Bord.docx
@@ -2143,6 +2143,10 @@
     </w:p>
     <w:p>
       <w:r>
+        <w:rPr>
+          <w:noProof/>
+          <w:lang w:eastAsia="fr-FR"/>
+        </w:rPr>
         <w:drawing>
           <wp:anchor distT="0" distB="0" distL="114300" distR="114300" simplePos="0" relativeHeight="251658240" behindDoc="0" locked="0" layoutInCell="1" allowOverlap="1" wp14:anchorId="3A4F3153" wp14:editId="0B2407EF">
             <wp:simplePos x="0" y="0"/>
@@ -2221,6 +2225,718 @@
     </w:p>
     <w:p/>
     <w:p>
+      <w:pPr>
+        <w:pStyle w:val="Titre1"/>
+      </w:pPr>
+      <w:r>
+        <w:t>Sprint 6 : PHP connexion PDO</w:t>
+      </w:r>
+    </w:p>
+    <w:p>
+      <w:r>
+        <w:t>Après une balise PHP,</w:t>
+      </w:r>
+    </w:p>
+    <w:p>
+      <w:pPr>
+        <w:shd w:val="clear" w:color="auto" w:fill="000000"/>
+        <w:spacing w:after="0" w:line="285" w:lineRule="atLeast"/>
+        <w:rPr>
+          <w:rFonts w:ascii="Consolas" w:eastAsia="Times New Roman" w:hAnsi="Consolas" w:cs="Times New Roman"/>
+          <w:color w:val="FFFFFF"/>
+          <w:sz w:val="21"/>
+          <w:szCs w:val="21"/>
+          <w:lang w:eastAsia="fr-FR"/>
+        </w:rPr>
+      </w:pPr>
+      <w:r>
+        <w:rPr>
+          <w:rFonts w:ascii="Consolas" w:eastAsia="Times New Roman" w:hAnsi="Consolas" w:cs="Times New Roman"/>
+          <w:color w:val="9CDCFE"/>
+          <w:sz w:val="21"/>
+          <w:szCs w:val="21"/>
+          <w:lang w:eastAsia="fr-FR"/>
+        </w:rPr>
+        <w:t>$host</w:t>
+      </w:r>
+      <w:r>
+        <w:rPr>
+          <w:rFonts w:ascii="Consolas" w:eastAsia="Times New Roman" w:hAnsi="Consolas" w:cs="Times New Roman"/>
+          <w:color w:val="FFFFFF"/>
+          <w:sz w:val="21"/>
+          <w:szCs w:val="21"/>
+          <w:lang w:eastAsia="fr-FR"/>
+        </w:rPr>
+        <w:t xml:space="preserve"> </w:t>
+      </w:r>
+      <w:r>
+        <w:rPr>
+          <w:rFonts w:ascii="Consolas" w:eastAsia="Times New Roman" w:hAnsi="Consolas" w:cs="Times New Roman"/>
+          <w:color w:val="D4D4D4"/>
+          <w:sz w:val="21"/>
+          <w:szCs w:val="21"/>
+          <w:lang w:eastAsia="fr-FR"/>
+        </w:rPr>
+        <w:t>=</w:t>
+      </w:r>
+      <w:r>
+        <w:rPr>
+          <w:rFonts w:ascii="Consolas" w:eastAsia="Times New Roman" w:hAnsi="Consolas" w:cs="Times New Roman"/>
+          <w:color w:val="FFFFFF"/>
+          <w:sz w:val="21"/>
+          <w:szCs w:val="21"/>
+          <w:lang w:eastAsia="fr-FR"/>
+        </w:rPr>
+        <w:t xml:space="preserve"> </w:t>
+      </w:r>
+      <w:r>
+        <w:rPr>
+          <w:rFonts w:ascii="Consolas" w:eastAsia="Times New Roman" w:hAnsi="Consolas" w:cs="Times New Roman"/>
+          <w:color w:val="CE9178"/>
+          <w:sz w:val="21"/>
+          <w:szCs w:val="21"/>
+          <w:lang w:eastAsia="fr-FR"/>
+        </w:rPr>
+        <w:t>"</w:t>
+      </w:r>
+      <w:proofErr w:type="spellStart"/>
+      <w:r>
+        <w:rPr>
+          <w:rFonts w:ascii="Consolas" w:eastAsia="Times New Roman" w:hAnsi="Consolas" w:cs="Times New Roman"/>
+          <w:color w:val="CE9178"/>
+          <w:sz w:val="21"/>
+          <w:szCs w:val="21"/>
+          <w:lang w:eastAsia="fr-FR"/>
+        </w:rPr>
+        <w:t>localhost</w:t>
+      </w:r>
+      <w:proofErr w:type="spellEnd"/>
+      <w:proofErr w:type="gramStart"/>
+      <w:r>
+        <w:rPr>
+          <w:rFonts w:ascii="Consolas" w:eastAsia="Times New Roman" w:hAnsi="Consolas" w:cs="Times New Roman"/>
+          <w:color w:val="CE9178"/>
+          <w:sz w:val="21"/>
+          <w:szCs w:val="21"/>
+          <w:lang w:eastAsia="fr-FR"/>
+        </w:rPr>
+        <w:t>"</w:t>
+      </w:r>
+      <w:r>
+        <w:rPr>
+          <w:rFonts w:ascii="Consolas" w:eastAsia="Times New Roman" w:hAnsi="Consolas" w:cs="Times New Roman"/>
+          <w:color w:val="FFFFFF"/>
+          <w:sz w:val="21"/>
+          <w:szCs w:val="21"/>
+          <w:lang w:eastAsia="fr-FR"/>
+        </w:rPr>
+        <w:t>;</w:t>
+      </w:r>
+      <w:r>
+        <w:rPr>
+          <w:rFonts w:ascii="Consolas" w:eastAsia="Times New Roman" w:hAnsi="Consolas" w:cs="Times New Roman"/>
+          <w:color w:val="FFFFFF"/>
+          <w:sz w:val="21"/>
+          <w:szCs w:val="21"/>
+          <w:lang w:eastAsia="fr-FR"/>
+        </w:rPr>
+        <w:t xml:space="preserve">   </w:t>
+      </w:r>
+      <w:proofErr w:type="gramEnd"/>
+      <w:r>
+        <w:rPr>
+          <w:rFonts w:ascii="Consolas" w:eastAsia="Times New Roman" w:hAnsi="Consolas" w:cs="Times New Roman"/>
+          <w:color w:val="FFFFFF"/>
+          <w:sz w:val="21"/>
+          <w:szCs w:val="21"/>
+          <w:lang w:eastAsia="fr-FR"/>
+        </w:rPr>
+        <w:t>// il est plus simple de stocker sous forme de variable car s’il y a une modification, on aura qu’à le modifier ici. =&gt; Simplifie la maintenabilité</w:t>
+      </w:r>
+    </w:p>
+    <w:p>
+      <w:pPr>
+        <w:shd w:val="clear" w:color="auto" w:fill="000000"/>
+        <w:spacing w:after="0" w:line="285" w:lineRule="atLeast"/>
+        <w:rPr>
+          <w:rFonts w:ascii="Consolas" w:eastAsia="Times New Roman" w:hAnsi="Consolas" w:cs="Times New Roman"/>
+          <w:color w:val="FFFFFF"/>
+          <w:sz w:val="21"/>
+          <w:szCs w:val="21"/>
+          <w:lang w:eastAsia="fr-FR"/>
+        </w:rPr>
+      </w:pPr>
+      <w:r>
+        <w:rPr>
+          <w:rFonts w:ascii="Consolas" w:eastAsia="Times New Roman" w:hAnsi="Consolas" w:cs="Times New Roman"/>
+          <w:color w:val="9CDCFE"/>
+          <w:sz w:val="21"/>
+          <w:szCs w:val="21"/>
+          <w:lang w:eastAsia="fr-FR"/>
+        </w:rPr>
+        <w:t>$</w:t>
+      </w:r>
+      <w:proofErr w:type="spellStart"/>
+      <w:r>
+        <w:rPr>
+          <w:rFonts w:ascii="Consolas" w:eastAsia="Times New Roman" w:hAnsi="Consolas" w:cs="Times New Roman"/>
+          <w:color w:val="9CDCFE"/>
+          <w:sz w:val="21"/>
+          <w:szCs w:val="21"/>
+          <w:lang w:eastAsia="fr-FR"/>
+        </w:rPr>
+        <w:t>dbname</w:t>
+      </w:r>
+      <w:proofErr w:type="spellEnd"/>
+      <w:r>
+        <w:rPr>
+          <w:rFonts w:ascii="Consolas" w:eastAsia="Times New Roman" w:hAnsi="Consolas" w:cs="Times New Roman"/>
+          <w:color w:val="D4D4D4"/>
+          <w:sz w:val="21"/>
+          <w:szCs w:val="21"/>
+          <w:lang w:eastAsia="fr-FR"/>
+        </w:rPr>
+        <w:t>=</w:t>
+      </w:r>
+      <w:r>
+        <w:rPr>
+          <w:rFonts w:ascii="Consolas" w:eastAsia="Times New Roman" w:hAnsi="Consolas" w:cs="Times New Roman"/>
+          <w:color w:val="CE9178"/>
+          <w:sz w:val="21"/>
+          <w:szCs w:val="21"/>
+          <w:lang w:eastAsia="fr-FR"/>
+        </w:rPr>
+        <w:t>"</w:t>
+      </w:r>
+      <w:proofErr w:type="spellStart"/>
+      <w:r>
+        <w:rPr>
+          <w:rFonts w:ascii="Consolas" w:eastAsia="Times New Roman" w:hAnsi="Consolas" w:cs="Times New Roman"/>
+          <w:color w:val="CE9178"/>
+          <w:sz w:val="21"/>
+          <w:szCs w:val="21"/>
+          <w:lang w:eastAsia="fr-FR"/>
+        </w:rPr>
+        <w:t>entrepages</w:t>
+      </w:r>
+      <w:proofErr w:type="spellEnd"/>
+      <w:proofErr w:type="gramStart"/>
+      <w:r>
+        <w:rPr>
+          <w:rFonts w:ascii="Consolas" w:eastAsia="Times New Roman" w:hAnsi="Consolas" w:cs="Times New Roman"/>
+          <w:color w:val="CE9178"/>
+          <w:sz w:val="21"/>
+          <w:szCs w:val="21"/>
+          <w:lang w:eastAsia="fr-FR"/>
+        </w:rPr>
+        <w:t>"</w:t>
+      </w:r>
+      <w:r>
+        <w:rPr>
+          <w:rFonts w:ascii="Consolas" w:eastAsia="Times New Roman" w:hAnsi="Consolas" w:cs="Times New Roman"/>
+          <w:color w:val="FFFFFF"/>
+          <w:sz w:val="21"/>
+          <w:szCs w:val="21"/>
+          <w:lang w:eastAsia="fr-FR"/>
+        </w:rPr>
+        <w:t>;</w:t>
+      </w:r>
+      <w:proofErr w:type="gramEnd"/>
+    </w:p>
+    <w:p>
+      <w:pPr>
+        <w:shd w:val="clear" w:color="auto" w:fill="000000"/>
+        <w:spacing w:after="0" w:line="285" w:lineRule="atLeast"/>
+        <w:rPr>
+          <w:rFonts w:ascii="Consolas" w:eastAsia="Times New Roman" w:hAnsi="Consolas" w:cs="Times New Roman"/>
+          <w:color w:val="FFFFFF"/>
+          <w:sz w:val="21"/>
+          <w:szCs w:val="21"/>
+          <w:lang w:eastAsia="fr-FR"/>
+        </w:rPr>
+      </w:pPr>
+      <w:r>
+        <w:rPr>
+          <w:rFonts w:ascii="Consolas" w:eastAsia="Times New Roman" w:hAnsi="Consolas" w:cs="Times New Roman"/>
+          <w:color w:val="9CDCFE"/>
+          <w:sz w:val="21"/>
+          <w:szCs w:val="21"/>
+          <w:lang w:eastAsia="fr-FR"/>
+        </w:rPr>
+        <w:t>$</w:t>
+      </w:r>
+      <w:proofErr w:type="spellStart"/>
+      <w:r>
+        <w:rPr>
+          <w:rFonts w:ascii="Consolas" w:eastAsia="Times New Roman" w:hAnsi="Consolas" w:cs="Times New Roman"/>
+          <w:color w:val="9CDCFE"/>
+          <w:sz w:val="21"/>
+          <w:szCs w:val="21"/>
+          <w:lang w:eastAsia="fr-FR"/>
+        </w:rPr>
+        <w:t>username</w:t>
+      </w:r>
+      <w:proofErr w:type="spellEnd"/>
+      <w:r>
+        <w:rPr>
+          <w:rFonts w:ascii="Consolas" w:eastAsia="Times New Roman" w:hAnsi="Consolas" w:cs="Times New Roman"/>
+          <w:color w:val="D4D4D4"/>
+          <w:sz w:val="21"/>
+          <w:szCs w:val="21"/>
+          <w:lang w:eastAsia="fr-FR"/>
+        </w:rPr>
+        <w:t>=</w:t>
+      </w:r>
+      <w:r>
+        <w:rPr>
+          <w:rFonts w:ascii="Consolas" w:eastAsia="Times New Roman" w:hAnsi="Consolas" w:cs="Times New Roman"/>
+          <w:color w:val="CE9178"/>
+          <w:sz w:val="21"/>
+          <w:szCs w:val="21"/>
+          <w:lang w:eastAsia="fr-FR"/>
+        </w:rPr>
+        <w:t>"</w:t>
+      </w:r>
+      <w:proofErr w:type="spellStart"/>
+      <w:r>
+        <w:rPr>
+          <w:rFonts w:ascii="Consolas" w:eastAsia="Times New Roman" w:hAnsi="Consolas" w:cs="Times New Roman"/>
+          <w:color w:val="CE9178"/>
+          <w:sz w:val="21"/>
+          <w:szCs w:val="21"/>
+          <w:lang w:eastAsia="fr-FR"/>
+        </w:rPr>
+        <w:t>root</w:t>
+      </w:r>
+      <w:proofErr w:type="spellEnd"/>
+      <w:proofErr w:type="gramStart"/>
+      <w:r>
+        <w:rPr>
+          <w:rFonts w:ascii="Consolas" w:eastAsia="Times New Roman" w:hAnsi="Consolas" w:cs="Times New Roman"/>
+          <w:color w:val="CE9178"/>
+          <w:sz w:val="21"/>
+          <w:szCs w:val="21"/>
+          <w:lang w:eastAsia="fr-FR"/>
+        </w:rPr>
+        <w:t>"</w:t>
+      </w:r>
+      <w:r>
+        <w:rPr>
+          <w:rFonts w:ascii="Consolas" w:eastAsia="Times New Roman" w:hAnsi="Consolas" w:cs="Times New Roman"/>
+          <w:color w:val="FFFFFF"/>
+          <w:sz w:val="21"/>
+          <w:szCs w:val="21"/>
+          <w:lang w:eastAsia="fr-FR"/>
+        </w:rPr>
+        <w:t>;</w:t>
+      </w:r>
+      <w:proofErr w:type="gramEnd"/>
+    </w:p>
+    <w:p>
+      <w:pPr>
+        <w:shd w:val="clear" w:color="auto" w:fill="000000"/>
+        <w:spacing w:after="0" w:line="285" w:lineRule="atLeast"/>
+        <w:rPr>
+          <w:rFonts w:ascii="Consolas" w:eastAsia="Times New Roman" w:hAnsi="Consolas" w:cs="Times New Roman"/>
+          <w:color w:val="FFFFFF"/>
+          <w:sz w:val="21"/>
+          <w:szCs w:val="21"/>
+          <w:lang w:eastAsia="fr-FR"/>
+        </w:rPr>
+      </w:pPr>
+      <w:r>
+        <w:rPr>
+          <w:rFonts w:ascii="Consolas" w:eastAsia="Times New Roman" w:hAnsi="Consolas" w:cs="Times New Roman"/>
+          <w:color w:val="9CDCFE"/>
+          <w:sz w:val="21"/>
+          <w:szCs w:val="21"/>
+          <w:lang w:eastAsia="fr-FR"/>
+        </w:rPr>
+        <w:t>$</w:t>
+      </w:r>
+      <w:proofErr w:type="spellStart"/>
+      <w:r>
+        <w:rPr>
+          <w:rFonts w:ascii="Consolas" w:eastAsia="Times New Roman" w:hAnsi="Consolas" w:cs="Times New Roman"/>
+          <w:color w:val="9CDCFE"/>
+          <w:sz w:val="21"/>
+          <w:szCs w:val="21"/>
+          <w:lang w:eastAsia="fr-FR"/>
+        </w:rPr>
+        <w:t>password</w:t>
+      </w:r>
+      <w:proofErr w:type="spellEnd"/>
+      <w:r>
+        <w:rPr>
+          <w:rFonts w:ascii="Consolas" w:eastAsia="Times New Roman" w:hAnsi="Consolas" w:cs="Times New Roman"/>
+          <w:color w:val="D4D4D4"/>
+          <w:sz w:val="21"/>
+          <w:szCs w:val="21"/>
+          <w:lang w:eastAsia="fr-FR"/>
+        </w:rPr>
+        <w:t>=</w:t>
+      </w:r>
+      <w:r>
+        <w:rPr>
+          <w:rFonts w:ascii="Consolas" w:eastAsia="Times New Roman" w:hAnsi="Consolas" w:cs="Times New Roman"/>
+          <w:color w:val="CE9178"/>
+          <w:sz w:val="21"/>
+          <w:szCs w:val="21"/>
+          <w:lang w:eastAsia="fr-FR"/>
+        </w:rPr>
+        <w:t>"</w:t>
+      </w:r>
+      <w:proofErr w:type="gramStart"/>
+      <w:r>
+        <w:rPr>
+          <w:rFonts w:ascii="Consolas" w:eastAsia="Times New Roman" w:hAnsi="Consolas" w:cs="Times New Roman"/>
+          <w:color w:val="CE9178"/>
+          <w:sz w:val="21"/>
+          <w:szCs w:val="21"/>
+          <w:lang w:eastAsia="fr-FR"/>
+        </w:rPr>
+        <w:t>"</w:t>
+      </w:r>
+      <w:r>
+        <w:rPr>
+          <w:rFonts w:ascii="Consolas" w:eastAsia="Times New Roman" w:hAnsi="Consolas" w:cs="Times New Roman"/>
+          <w:color w:val="FFFFFF"/>
+          <w:sz w:val="21"/>
+          <w:szCs w:val="21"/>
+          <w:lang w:eastAsia="fr-FR"/>
+        </w:rPr>
+        <w:t>;</w:t>
+      </w:r>
+      <w:proofErr w:type="gramEnd"/>
+    </w:p>
+    <w:p/>
+    <w:p>
+      <w:proofErr w:type="spellStart"/>
+      <w:r>
+        <w:t>Try</w:t>
+      </w:r>
+      <w:proofErr w:type="spellEnd"/>
+      <w:r>
+        <w:t xml:space="preserve"> … Catch : Avec </w:t>
+      </w:r>
+      <w:proofErr w:type="spellStart"/>
+      <w:r>
+        <w:t>Try</w:t>
+      </w:r>
+      <w:proofErr w:type="spellEnd"/>
+      <w:r>
+        <w:t xml:space="preserve">, essai de la programmation et catch pour faire remonter l’erreur </w:t>
+      </w:r>
+    </w:p>
+    <w:p>
+      <w:proofErr w:type="gramStart"/>
+      <w:r>
+        <w:t>Die(</w:t>
+      </w:r>
+      <w:proofErr w:type="gramEnd"/>
+      <w:r>
+        <w:t>) : pour afficher l’erreur et arrêter le programme directement</w:t>
+      </w:r>
+    </w:p>
+    <w:p>
+      <w:r>
+        <w:t xml:space="preserve">Rappel </w:t>
+      </w:r>
+      <w:r>
+        <w:t>du PDO : classe (PDO) / objet ($</w:t>
+      </w:r>
+      <w:proofErr w:type="spellStart"/>
+      <w:r>
+        <w:t>pdo</w:t>
+      </w:r>
+      <w:proofErr w:type="spellEnd"/>
+      <w:r>
+        <w:t>) / méthode (</w:t>
+      </w:r>
+      <w:proofErr w:type="spellStart"/>
+      <w:r>
+        <w:t>query</w:t>
+      </w:r>
+      <w:proofErr w:type="spellEnd"/>
+      <w:r>
+        <w:t>(</w:t>
+      </w:r>
+      <w:proofErr w:type="gramStart"/>
+      <w:r>
+        <w:t>),</w:t>
+      </w:r>
+      <w:proofErr w:type="spellStart"/>
+      <w:r>
+        <w:t>etc</w:t>
+      </w:r>
+      <w:proofErr w:type="spellEnd"/>
+      <w:proofErr w:type="gramEnd"/>
+      <w:r>
+        <w:t>)/ variables.($host)</w:t>
+      </w:r>
+    </w:p>
+    <w:tbl>
+      <w:tblPr>
+        <w:tblStyle w:val="Grilledutableau"/>
+        <w:tblW w:w="0" w:type="auto"/>
+        <w:tblLook w:val="04A0" w:firstRow="1" w:lastRow="0" w:firstColumn="1" w:lastColumn="0" w:noHBand="0" w:noVBand="1"/>
+      </w:tblPr>
+      <w:tblGrid>
+        <w:gridCol w:w="1164"/>
+        <w:gridCol w:w="1127"/>
+        <w:gridCol w:w="2222"/>
+        <w:gridCol w:w="4549"/>
+      </w:tblGrid>
+      <w:tr>
+        <w:tc>
+          <w:tcPr>
+            <w:tcW w:w="0" w:type="auto"/>
+            <w:hideMark/>
+          </w:tcPr>
+          <w:p>
+            <w:pPr>
+              <w:spacing w:after="160" w:line="259" w:lineRule="auto"/>
+              <w:rPr>
+                <w:b/>
+                <w:bCs/>
+              </w:rPr>
+            </w:pPr>
+            <w:r>
+              <w:rPr>
+                <w:b/>
+                <w:bCs/>
+              </w:rPr>
+              <w:t>Opérateur</w:t>
+            </w:r>
+          </w:p>
+        </w:tc>
+        <w:tc>
+          <w:tcPr>
+            <w:tcW w:w="0" w:type="auto"/>
+            <w:hideMark/>
+          </w:tcPr>
+          <w:p>
+            <w:pPr>
+              <w:spacing w:after="160" w:line="259" w:lineRule="auto"/>
+              <w:rPr>
+                <w:b/>
+                <w:bCs/>
+              </w:rPr>
+            </w:pPr>
+            <w:r>
+              <w:rPr>
+                <w:b/>
+                <w:bCs/>
+              </w:rPr>
+              <w:t>Utilisé avec</w:t>
+            </w:r>
+          </w:p>
+        </w:tc>
+        <w:tc>
+          <w:tcPr>
+            <w:tcW w:w="0" w:type="auto"/>
+            <w:hideMark/>
+          </w:tcPr>
+          <w:p>
+            <w:pPr>
+              <w:spacing w:after="160" w:line="259" w:lineRule="auto"/>
+              <w:rPr>
+                <w:b/>
+                <w:bCs/>
+              </w:rPr>
+            </w:pPr>
+            <w:r>
+              <w:rPr>
+                <w:b/>
+                <w:bCs/>
+              </w:rPr>
+              <w:t>Exemple</w:t>
+            </w:r>
+          </w:p>
+        </w:tc>
+        <w:tc>
+          <w:tcPr>
+            <w:tcW w:w="0" w:type="auto"/>
+            <w:hideMark/>
+          </w:tcPr>
+          <w:p>
+            <w:pPr>
+              <w:spacing w:after="160" w:line="259" w:lineRule="auto"/>
+              <w:rPr>
+                <w:b/>
+                <w:bCs/>
+              </w:rPr>
+            </w:pPr>
+            <w:r>
+              <w:rPr>
+                <w:b/>
+                <w:bCs/>
+              </w:rPr>
+              <w:t>Signification</w:t>
+            </w:r>
+          </w:p>
+        </w:tc>
+      </w:tr>
+      <w:tr>
+        <w:tc>
+          <w:tcPr>
+            <w:tcW w:w="0" w:type="auto"/>
+            <w:hideMark/>
+          </w:tcPr>
+          <w:p>
+            <w:pPr>
+              <w:spacing w:after="160" w:line="259" w:lineRule="auto"/>
+            </w:pPr>
+            <w:r>
+              <w:t>-&gt;</w:t>
+            </w:r>
+          </w:p>
+        </w:tc>
+        <w:tc>
+          <w:tcPr>
+            <w:tcW w:w="0" w:type="auto"/>
+            <w:hideMark/>
+          </w:tcPr>
+          <w:p>
+            <w:pPr>
+              <w:spacing w:after="160" w:line="259" w:lineRule="auto"/>
+            </w:pPr>
+            <w:r>
+              <w:t>un objet</w:t>
+            </w:r>
+          </w:p>
+        </w:tc>
+        <w:tc>
+          <w:tcPr>
+            <w:tcW w:w="0" w:type="auto"/>
+            <w:hideMark/>
+          </w:tcPr>
+          <w:p>
+            <w:pPr>
+              <w:spacing w:after="160" w:line="259" w:lineRule="auto"/>
+            </w:pPr>
+            <w:r>
+              <w:t>$</w:t>
+            </w:r>
+            <w:proofErr w:type="spellStart"/>
+            <w:r>
+              <w:t>pdo</w:t>
+            </w:r>
+            <w:proofErr w:type="spellEnd"/>
+            <w:r>
+              <w:t>-&gt;</w:t>
+            </w:r>
+            <w:proofErr w:type="spellStart"/>
+            <w:r>
+              <w:t>query</w:t>
+            </w:r>
+            <w:proofErr w:type="spellEnd"/>
+            <w:r>
+              <w:t>()</w:t>
+            </w:r>
+          </w:p>
+        </w:tc>
+        <w:tc>
+          <w:tcPr>
+            <w:tcW w:w="0" w:type="auto"/>
+            <w:hideMark/>
+          </w:tcPr>
+          <w:p>
+            <w:pPr>
+              <w:spacing w:after="160" w:line="259" w:lineRule="auto"/>
+            </w:pPr>
+            <w:r>
+              <w:t>Demande à cet objet de faire quelque chose</w:t>
+            </w:r>
+          </w:p>
+        </w:tc>
+      </w:tr>
+      <w:tr>
+        <w:tc>
+          <w:tcPr>
+            <w:tcW w:w="0" w:type="auto"/>
+            <w:hideMark/>
+          </w:tcPr>
+          <w:p>
+            <w:pPr>
+              <w:spacing w:after="160" w:line="259" w:lineRule="auto"/>
+            </w:pPr>
+            <w:r>
+              <w:t>::</w:t>
+            </w:r>
+          </w:p>
+        </w:tc>
+        <w:tc>
+          <w:tcPr>
+            <w:tcW w:w="0" w:type="auto"/>
+            <w:hideMark/>
+          </w:tcPr>
+          <w:p>
+            <w:pPr>
+              <w:spacing w:after="160" w:line="259" w:lineRule="auto"/>
+            </w:pPr>
+            <w:r>
+              <w:t>une classe</w:t>
+            </w:r>
+          </w:p>
+        </w:tc>
+        <w:tc>
+          <w:tcPr>
+            <w:tcW w:w="0" w:type="auto"/>
+            <w:hideMark/>
+          </w:tcPr>
+          <w:p>
+            <w:pPr>
+              <w:spacing w:after="160" w:line="259" w:lineRule="auto"/>
+            </w:pPr>
+            <w:r>
+              <w:t>PDO::ATTR_ERRMODE</w:t>
+            </w:r>
+          </w:p>
+        </w:tc>
+        <w:tc>
+          <w:tcPr>
+            <w:tcW w:w="0" w:type="auto"/>
+            <w:hideMark/>
+          </w:tcPr>
+          <w:p>
+            <w:pPr>
+              <w:spacing w:after="160" w:line="259" w:lineRule="auto"/>
+            </w:pPr>
+            <w:r>
+              <w:t xml:space="preserve">Accède à une </w:t>
+            </w:r>
+            <w:proofErr w:type="spellStart"/>
+            <w:r>
+              <w:t>c</w:t>
+            </w:r>
+            <w:r>
+              <w:t>l</w:t>
+            </w:r>
+            <w:r>
+              <w:t>onstante</w:t>
+            </w:r>
+            <w:proofErr w:type="spellEnd"/>
+            <w:r>
+              <w:t xml:space="preserve"> ou un élément appartenant à la classe</w:t>
+            </w:r>
+          </w:p>
+        </w:tc>
+      </w:tr>
+    </w:tbl>
+    <w:p/>
+    <w:p>
+      <w:r>
+        <w:t xml:space="preserve">Ne pas oublier de faire </w:t>
+      </w:r>
+      <w:proofErr w:type="spellStart"/>
+      <w:r>
+        <w:t>require</w:t>
+      </w:r>
+      <w:proofErr w:type="spellEnd"/>
+      <w:r>
+        <w:t xml:space="preserve"> once :</w:t>
+      </w:r>
       <w:bookmarkStart w:id="0" w:name="_GoBack"/>
       <w:bookmarkEnd w:id="0"/>
     </w:p>
@@ -3143,7 +3859,6 @@
   <w:style w:type="character" w:default="1" w:styleId="Policepardfaut">
     <w:name w:val="Default Paragraph Font"/>
     <w:uiPriority w:val="1"/>
-    <w:semiHidden/>
     <w:unhideWhenUsed/>
   </w:style>
   <w:style w:type="table" w:default="1" w:styleId="TableauNormal">

</xml_diff>